<commit_message>
docs: actualiza documentacion corporativa exhaustiva de TEMIS (Roadmap 2026, Marco de Trabajo y Diagnostico AS-IS/TO-BE)
</commit_message>
<xml_diff>
--- a/Temis/docs/Informe_Diagnostico_General_Proyecto_TEMIS.docx
+++ b/Temis/docs/Informe_Diagnostico_General_Proyecto_TEMIS.docx
@@ -2,6 +2,20 @@
 <file path=word/document.xml><?xml version="1.0" encoding="utf-8"?>
 <w:document xmlns:wpc="http://schemas.microsoft.com/office/word/2010/wordprocessingCanvas" xmlns:mo="http://schemas.microsoft.com/office/mac/office/2008/main" xmlns:mc="http://schemas.openxmlformats.org/markup-compatibility/2006" xmlns:mv="urn:schemas-microsoft-com:mac:vml" xmlns:o="urn:schemas-microsoft-com:office:office" xmlns:r="http://schemas.openxmlformats.org/officeDocument/2006/relationships" xmlns:m="http://schemas.openxmlformats.org/officeDocument/2006/math" xmlns:v="urn:schemas-microsoft-com:vml" xmlns:wp14="http://schemas.microsoft.com/office/word/2010/wordprocessingDrawing" xmlns:wp="http://schemas.openxmlformats.org/drawingml/2006/wordprocessingDrawing" xmlns:w10="urn:schemas-microsoft-com:office:word" xmlns:w="http://schemas.openxmlformats.org/wordprocessingml/2006/main" xmlns:w14="http://schemas.microsoft.com/office/word/2010/wordml" xmlns:wpg="http://schemas.microsoft.com/office/word/2010/wordprocessingGroup" xmlns:wpi="http://schemas.microsoft.com/office/word/2010/wordprocessingInk" xmlns:wne="http://schemas.microsoft.com/office/word/2006/wordml" xmlns:wps="http://schemas.microsoft.com/office/word/2010/wordprocessingShape" mc:Ignorable="w14 wp14">
   <w:body>
+    <w:p>
+      <w:pPr>
+        <w:spacing w:after="40"/>
+      </w:pPr>
+      <w:r>
+        <w:rPr>
+          <w:rFonts w:ascii="Calibri" w:hAnsi="Calibri"/>
+          <w:b/>
+          <w:color w:val="2563EB"/>
+          <w:sz w:val="18"/>
+        </w:rPr>
+        <w:t>TEMIS PROCESS SUITE  |  INFORME DIAGNÓSTICO &amp; ANÁLISIS DE EFICIENCIA OPERATIVA</w:t>
+      </w:r>
+    </w:p>
     <w:p>
       <w:pPr>
         <w:spacing w:after="80"/>
@@ -10,38 +24,24 @@
         <w:rPr>
           <w:rFonts w:ascii="Calibri" w:hAnsi="Calibri"/>
           <w:b/>
-          <w:color w:val="2563EB"/>
-          <w:sz w:val="18"/>
-        </w:rPr>
-        <w:t>TEMIS PROCESS SUITE  |  INFORME DIAGNÓSTICO &amp; ANÁLISIS DE PROCESOS</w:t>
-      </w:r>
-    </w:p>
-    <w:p>
-      <w:pPr>
-        <w:spacing w:after="120"/>
-      </w:pPr>
-      <w:r>
-        <w:rPr>
-          <w:rFonts w:ascii="Calibri" w:hAnsi="Calibri"/>
-          <w:b/>
           <w:color w:val="1E3A8A"/>
-          <w:sz w:val="44"/>
+          <w:sz w:val="40"/>
         </w:rPr>
         <w:t>Informe Diagnóstico General y Análisis de Procesos — Proyecto TEMIS</w:t>
       </w:r>
     </w:p>
     <w:p>
       <w:pPr>
-        <w:spacing w:after="360"/>
+        <w:spacing w:after="280"/>
       </w:pPr>
       <w:r>
         <w:rPr>
           <w:rFonts w:ascii="Calibri" w:hAnsi="Calibri"/>
           <w:i/>
           <w:color w:val="475569"/>
-          <w:sz w:val="22"/>
+          <w:sz w:val="21"/>
         </w:rPr>
-        <w:t>Evaluación del estado actual (AS-IS) de documentación operativa vs la solución objetivo (TO-BE) de la Suite TEMIS.</w:t>
+        <w:t>Evaluación del Estado Actual (AS-IS) de Modelado y Documentación de Procesos vs Solución Objetivo (TO-BE) de la Suite TEMIS.</w:t>
       </w:r>
     </w:p>
     <w:tbl>
@@ -61,10 +61,648 @@
         <w:tc>
           <w:tcPr>
             <w:tcW w:type="dxa" w:w="2160"/>
-            <w:shd w:fill="F8FAFC"/>
+            <w:shd w:fill="F1F5F9"/>
             <w:tcMar>
-              <w:top w:w="80" w:type="dxa"/>
-              <w:bottom w:w="80" w:type="dxa"/>
+              <w:top w:w="70" w:type="dxa"/>
+              <w:bottom w:w="70" w:type="dxa"/>
+              <w:left w:w="90" w:type="dxa"/>
+              <w:right w:w="90" w:type="dxa"/>
+            </w:tcMar>
+          </w:tcPr>
+          <w:p>
+            <w:r>
+              <w:rPr>
+                <w:rFonts w:ascii="Calibri" w:hAnsi="Calibri"/>
+                <w:b/>
+                <w:color w:val="1E3A8A"/>
+                <w:sz w:val="17"/>
+              </w:rPr>
+              <w:t>Iniciativa:</w:t>
+            </w:r>
+          </w:p>
+        </w:tc>
+        <w:tc>
+          <w:tcPr>
+            <w:tcW w:type="dxa" w:w="2160"/>
+            <w:shd w:fill="FFFFFF"/>
+            <w:tcMar>
+              <w:top w:w="70" w:type="dxa"/>
+              <w:bottom w:w="70" w:type="dxa"/>
+              <w:left w:w="90" w:type="dxa"/>
+              <w:right w:w="90" w:type="dxa"/>
+            </w:tcMar>
+          </w:tcPr>
+          <w:p>
+            <w:r>
+              <w:rPr>
+                <w:rFonts w:ascii="Calibri" w:hAnsi="Calibri"/>
+                <w:color w:val="0F172A"/>
+                <w:sz w:val="17"/>
+              </w:rPr>
+              <w:t>Proyecto TEMIS (BPMN Suite &amp; Governance)</w:t>
+            </w:r>
+          </w:p>
+        </w:tc>
+        <w:tc>
+          <w:tcPr>
+            <w:tcW w:type="dxa" w:w="2160"/>
+            <w:shd w:fill="F1F5F9"/>
+            <w:tcMar>
+              <w:top w:w="70" w:type="dxa"/>
+              <w:bottom w:w="70" w:type="dxa"/>
+              <w:left w:w="90" w:type="dxa"/>
+              <w:right w:w="90" w:type="dxa"/>
+            </w:tcMar>
+          </w:tcPr>
+          <w:p>
+            <w:r>
+              <w:rPr>
+                <w:rFonts w:ascii="Calibri" w:hAnsi="Calibri"/>
+                <w:b/>
+                <w:color w:val="1E3A8A"/>
+                <w:sz w:val="17"/>
+              </w:rPr>
+              <w:t>Código:</w:t>
+            </w:r>
+          </w:p>
+        </w:tc>
+        <w:tc>
+          <w:tcPr>
+            <w:tcW w:type="dxa" w:w="2160"/>
+            <w:shd w:fill="FFFFFF"/>
+            <w:tcMar>
+              <w:top w:w="70" w:type="dxa"/>
+              <w:bottom w:w="70" w:type="dxa"/>
+              <w:left w:w="90" w:type="dxa"/>
+              <w:right w:w="90" w:type="dxa"/>
+            </w:tcMar>
+          </w:tcPr>
+          <w:p>
+            <w:r>
+              <w:rPr>
+                <w:rFonts w:ascii="Calibri" w:hAnsi="Calibri"/>
+                <w:color w:val="0F172A"/>
+                <w:sz w:val="17"/>
+              </w:rPr>
+              <w:t>TEMIS-GOV-2026-V1</w:t>
+            </w:r>
+          </w:p>
+        </w:tc>
+      </w:tr>
+      <w:tr>
+        <w:tc>
+          <w:tcPr>
+            <w:tcW w:type="dxa" w:w="2160"/>
+            <w:shd w:fill="F1F5F9"/>
+            <w:tcMar>
+              <w:top w:w="70" w:type="dxa"/>
+              <w:bottom w:w="70" w:type="dxa"/>
+              <w:left w:w="90" w:type="dxa"/>
+              <w:right w:w="90" w:type="dxa"/>
+            </w:tcMar>
+          </w:tcPr>
+          <w:p>
+            <w:r>
+              <w:rPr>
+                <w:rFonts w:ascii="Calibri" w:hAnsi="Calibri"/>
+                <w:b/>
+                <w:color w:val="1E3A8A"/>
+                <w:sz w:val="17"/>
+              </w:rPr>
+              <w:t>Sponsor:</w:t>
+            </w:r>
+          </w:p>
+        </w:tc>
+        <w:tc>
+          <w:tcPr>
+            <w:tcW w:type="dxa" w:w="2160"/>
+            <w:shd w:fill="FFFFFF"/>
+            <w:tcMar>
+              <w:top w:w="70" w:type="dxa"/>
+              <w:bottom w:w="70" w:type="dxa"/>
+              <w:left w:w="90" w:type="dxa"/>
+              <w:right w:w="90" w:type="dxa"/>
+            </w:tcMar>
+          </w:tcPr>
+          <w:p>
+            <w:r>
+              <w:rPr>
+                <w:rFonts w:ascii="Calibri" w:hAnsi="Calibri"/>
+                <w:color w:val="0F172A"/>
+                <w:sz w:val="17"/>
+              </w:rPr>
+              <w:t>Dirección de Operaciones &amp; Tecnología</w:t>
+            </w:r>
+          </w:p>
+        </w:tc>
+        <w:tc>
+          <w:tcPr>
+            <w:tcW w:type="dxa" w:w="2160"/>
+            <w:shd w:fill="F1F5F9"/>
+            <w:tcMar>
+              <w:top w:w="70" w:type="dxa"/>
+              <w:bottom w:w="70" w:type="dxa"/>
+              <w:left w:w="90" w:type="dxa"/>
+              <w:right w:w="90" w:type="dxa"/>
+            </w:tcMar>
+          </w:tcPr>
+          <w:p>
+            <w:r>
+              <w:rPr>
+                <w:rFonts w:ascii="Calibri" w:hAnsi="Calibri"/>
+                <w:b/>
+                <w:color w:val="1E3A8A"/>
+                <w:sz w:val="17"/>
+              </w:rPr>
+              <w:t>Project Lead:</w:t>
+            </w:r>
+          </w:p>
+        </w:tc>
+        <w:tc>
+          <w:tcPr>
+            <w:tcW w:type="dxa" w:w="2160"/>
+            <w:shd w:fill="FFFFFF"/>
+            <w:tcMar>
+              <w:top w:w="70" w:type="dxa"/>
+              <w:bottom w:w="70" w:type="dxa"/>
+              <w:left w:w="90" w:type="dxa"/>
+              <w:right w:w="90" w:type="dxa"/>
+            </w:tcMar>
+          </w:tcPr>
+          <w:p>
+            <w:r>
+              <w:rPr>
+                <w:rFonts w:ascii="Calibri" w:hAnsi="Calibri"/>
+                <w:color w:val="0F172A"/>
+                <w:sz w:val="17"/>
+              </w:rPr>
+              <w:t>Ing. Mario Hurtado</w:t>
+            </w:r>
+          </w:p>
+        </w:tc>
+      </w:tr>
+      <w:tr>
+        <w:tc>
+          <w:tcPr>
+            <w:tcW w:type="dxa" w:w="2160"/>
+            <w:shd w:fill="F1F5F9"/>
+            <w:tcMar>
+              <w:top w:w="70" w:type="dxa"/>
+              <w:bottom w:w="70" w:type="dxa"/>
+              <w:left w:w="90" w:type="dxa"/>
+              <w:right w:w="90" w:type="dxa"/>
+            </w:tcMar>
+          </w:tcPr>
+          <w:p>
+            <w:r>
+              <w:rPr>
+                <w:rFonts w:ascii="Calibri" w:hAnsi="Calibri"/>
+                <w:b/>
+                <w:color w:val="1E3A8A"/>
+                <w:sz w:val="17"/>
+              </w:rPr>
+              <w:t>Periodo Oficial:</w:t>
+            </w:r>
+          </w:p>
+        </w:tc>
+        <w:tc>
+          <w:tcPr>
+            <w:tcW w:type="dxa" w:w="2160"/>
+            <w:shd w:fill="FFFFFF"/>
+            <w:tcMar>
+              <w:top w:w="70" w:type="dxa"/>
+              <w:bottom w:w="70" w:type="dxa"/>
+              <w:left w:w="90" w:type="dxa"/>
+              <w:right w:w="90" w:type="dxa"/>
+            </w:tcMar>
+          </w:tcPr>
+          <w:p>
+            <w:r>
+              <w:rPr>
+                <w:rFonts w:ascii="Calibri" w:hAnsi="Calibri"/>
+                <w:color w:val="0F172A"/>
+                <w:sz w:val="17"/>
+              </w:rPr>
+              <w:t>16 Ene 2026 – 04 Dic 2026</w:t>
+            </w:r>
+          </w:p>
+        </w:tc>
+        <w:tc>
+          <w:tcPr>
+            <w:tcW w:type="dxa" w:w="2160"/>
+            <w:shd w:fill="F1F5F9"/>
+            <w:tcMar>
+              <w:top w:w="70" w:type="dxa"/>
+              <w:bottom w:w="70" w:type="dxa"/>
+              <w:left w:w="90" w:type="dxa"/>
+              <w:right w:w="90" w:type="dxa"/>
+            </w:tcMar>
+          </w:tcPr>
+          <w:p>
+            <w:r>
+              <w:rPr>
+                <w:rFonts w:ascii="Calibri" w:hAnsi="Calibri"/>
+                <w:b/>
+                <w:color w:val="1E3A8A"/>
+                <w:sz w:val="17"/>
+              </w:rPr>
+              <w:t>Estatus:</w:t>
+            </w:r>
+          </w:p>
+        </w:tc>
+        <w:tc>
+          <w:tcPr>
+            <w:tcW w:type="dxa" w:w="2160"/>
+            <w:shd w:fill="FFFFFF"/>
+            <w:tcMar>
+              <w:top w:w="70" w:type="dxa"/>
+              <w:bottom w:w="70" w:type="dxa"/>
+              <w:left w:w="90" w:type="dxa"/>
+              <w:right w:w="90" w:type="dxa"/>
+            </w:tcMar>
+          </w:tcPr>
+          <w:p>
+            <w:r>
+              <w:rPr>
+                <w:rFonts w:ascii="Calibri" w:hAnsi="Calibri"/>
+                <w:color w:val="0F172A"/>
+                <w:sz w:val="17"/>
+              </w:rPr>
+              <w:t>Línea Base Oficial Aprobada</w:t>
+            </w:r>
+          </w:p>
+        </w:tc>
+      </w:tr>
+    </w:tbl>
+    <w:p>
+      <w:pPr>
+        <w:spacing w:after="200"/>
+      </w:pPr>
+    </w:p>
+    <w:p>
+      <w:pPr>
+        <w:spacing w:before="280" w:after="100"/>
+      </w:pPr>
+      <w:r>
+        <w:rPr>
+          <w:rFonts w:ascii="Calibri" w:hAnsi="Calibri"/>
+          <w:b/>
+          <w:color w:val="1E3A8A"/>
+          <w:sz w:val="26"/>
+        </w:rPr>
+        <w:t>1. Introducción y Contexto Estratégico</w:t>
+      </w:r>
+    </w:p>
+    <w:p>
+      <w:pPr>
+        <w:spacing w:after="80" w:line="276" w:lineRule="auto"/>
+      </w:pPr>
+      <w:r>
+        <w:rPr>
+          <w:rFonts w:ascii="Calibri" w:hAnsi="Calibri"/>
+          <w:color w:val="0F172A"/>
+          <w:sz w:val="19"/>
+        </w:rPr>
+        <w:t>En el marco de la transformación digital y optimización continua de operaciones en Maxi Send / Ecosistema Orbi, el Departamento de Innovación y Procesos llevó a cabo una exhaustiva auditoría diagnóstica sobre las prácticas, herramientas y flujos de trabajo empleados para el levantamiento, diagramación y documentación de políticas y procedimientos corporativos.</w:t>
+      </w:r>
+    </w:p>
+    <w:p>
+      <w:pPr>
+        <w:spacing w:after="80" w:line="276" w:lineRule="auto"/>
+      </w:pPr>
+      <w:r>
+        <w:rPr>
+          <w:rFonts w:ascii="Calibri" w:hAnsi="Calibri"/>
+          <w:color w:val="0F172A"/>
+          <w:sz w:val="19"/>
+        </w:rPr>
+        <w:t>El detonante principal de esta iniciativa radica en la insostenibilidad financiera y operativa de mantener licencias SaaS comerciales de terceros (específicamente Lucidchart de Lucid Software Inc.), las cuales representan un costo recurrente en dólares por usuario sin ofrecer integración con los sistemas internos de la empresa (Chronos, Freshdesk, Bria, WhatsApp), ni sincronización automática con los manuales de procedimientos exigidos por auditoría y cumplimiento.</w:t>
+      </w:r>
+    </w:p>
+    <w:p>
+      <w:pPr>
+        <w:spacing w:after="80" w:line="276" w:lineRule="auto"/>
+      </w:pPr>
+      <w:r>
+        <w:rPr>
+          <w:rFonts w:ascii="Calibri" w:hAnsi="Calibri"/>
+          <w:color w:val="0F172A"/>
+          <w:sz w:val="19"/>
+        </w:rPr>
+        <w:t>El presente informe sintetiza los hallazgos del estado actual (AS-IS), cuantifica los puntos de dolor que afectan la productividad de los analistas y define la arquitectura de la solución soberana TEMIS (TO-BE).</w:t>
+      </w:r>
+    </w:p>
+    <w:p>
+      <w:pPr>
+        <w:spacing w:before="280" w:after="100"/>
+      </w:pPr>
+      <w:r>
+        <w:rPr>
+          <w:rFonts w:ascii="Calibri" w:hAnsi="Calibri"/>
+          <w:b/>
+          <w:color w:val="1E3A8A"/>
+          <w:sz w:val="26"/>
+        </w:rPr>
+        <w:t>2. Diagnóstico del Estado Actual (AS-IS) y Puntos de Dolor (Pain Points)</w:t>
+      </w:r>
+    </w:p>
+    <w:p>
+      <w:pPr>
+        <w:spacing w:after="80" w:line="276" w:lineRule="auto"/>
+      </w:pPr>
+      <w:r>
+        <w:rPr>
+          <w:rFonts w:ascii="Calibri" w:hAnsi="Calibri"/>
+          <w:color w:val="0F172A"/>
+          <w:sz w:val="19"/>
+        </w:rPr>
+        <w:t>A partir de sesiones de trabajo con analistas de procesos, auditores y líderes de operaciones, se identificaron 6 puntos de dolor críticos:</w:t>
+      </w:r>
+    </w:p>
+    <w:p>
+      <w:pPr>
+        <w:spacing w:after="80" w:line="276" w:lineRule="auto"/>
+      </w:pPr>
+      <w:r>
+        <w:rPr>
+          <w:rFonts w:ascii="Calibri" w:hAnsi="Calibri"/>
+          <w:b/>
+          <w:color w:val="0F172A"/>
+          <w:sz w:val="19"/>
+        </w:rPr>
+        <w:t xml:space="preserve">• Pain Point 1: Drenaje Financiero por Licenciamiento SaaS de Lucidchart: </w:t>
+      </w:r>
+      <w:r>
+        <w:rPr>
+          <w:rFonts w:ascii="Calibri" w:hAnsi="Calibri"/>
+          <w:color w:val="0F172A"/>
+          <w:sz w:val="19"/>
+        </w:rPr>
+        <w:t>La organización erogaba pagos recurrentes anuales por licencias 'per-seat' de Lucidchart. Al ser una herramienta genérica, gran parte de las cuentas se mantenían subutilizadas o se requerían compras adicionales para nuevos analistas, elevando el costo total de propiedad (TCO) sin generar propiedad intelectual interna.</w:t>
+      </w:r>
+    </w:p>
+    <w:p>
+      <w:pPr>
+        <w:spacing w:after="80" w:line="276" w:lineRule="auto"/>
+      </w:pPr>
+      <w:r>
+        <w:rPr>
+          <w:rFonts w:ascii="Calibri" w:hAnsi="Calibri"/>
+          <w:b/>
+          <w:color w:val="0F172A"/>
+          <w:sz w:val="19"/>
+        </w:rPr>
+        <w:t xml:space="preserve">• Pain Point 2: Ruptura Operativa y Retrabajo Extremo entre Diagramas y Word: </w:t>
+      </w:r>
+      <w:r>
+        <w:rPr>
+          <w:rFonts w:ascii="Calibri" w:hAnsi="Calibri"/>
+          <w:color w:val="0F172A"/>
+          <w:sz w:val="19"/>
+        </w:rPr>
+        <w:t>El analista dibuja un diagrama de flujo en Lucidchart o Visio y posteriormente tiene que 'volver a redactar' manualmente un documento en Microsoft Word de 15 a 30 páginas para explicar cada paso. Este proceso desconectado consume entre 20 y 40 horas por proceso y genera graves discrepancias entre lo que dice el diagrama y lo que dice el manual.</w:t>
+      </w:r>
+    </w:p>
+    <w:p>
+      <w:pPr>
+        <w:spacing w:after="80" w:line="276" w:lineRule="auto"/>
+      </w:pPr>
+      <w:r>
+        <w:rPr>
+          <w:rFonts w:ascii="Calibri" w:hAnsi="Calibri"/>
+          <w:b/>
+          <w:color w:val="0F172A"/>
+          <w:sz w:val="19"/>
+        </w:rPr>
+        <w:t xml:space="preserve">• Pain Point 3: Falta de Estandarización en Simbología y Metadatos de Sistemas: </w:t>
+      </w:r>
+      <w:r>
+        <w:rPr>
+          <w:rFonts w:ascii="Calibri" w:hAnsi="Calibri"/>
+          <w:color w:val="0F172A"/>
+          <w:sz w:val="19"/>
+        </w:rPr>
+        <w:t>Cada analista empleaba estilos, colores y formas arbitrarias. En los diagramas no se especificaba con precisión técnica en qué sistema de software se realizaba la acción (ej. Chronos, Freshdesk) ni por qué canal de comunicación (ej. WhatsApp, Bria, Correo), provocando confusiones operativas en los usuarios finales.</w:t>
+      </w:r>
+    </w:p>
+    <w:p>
+      <w:pPr>
+        <w:spacing w:after="80" w:line="276" w:lineRule="auto"/>
+      </w:pPr>
+      <w:r>
+        <w:rPr>
+          <w:rFonts w:ascii="Calibri" w:hAnsi="Calibri"/>
+          <w:b/>
+          <w:color w:val="0F172A"/>
+          <w:sz w:val="19"/>
+        </w:rPr>
+        <w:t xml:space="preserve">• Pain Point 4: Barrera de Entrada y Complejidad para Analistas de Negocio: </w:t>
+      </w:r>
+      <w:r>
+        <w:rPr>
+          <w:rFonts w:ascii="Calibri" w:hAnsi="Calibri"/>
+          <w:color w:val="0F172A"/>
+          <w:sz w:val="19"/>
+        </w:rPr>
+        <w:t>Construir un flujo complejo directamente en un lienzo gráfico en blanco requiere habilidades avanzadas de diseño. Los analistas de negocio prefieren capturar la información en tablas estructuradas (SIPOC), pero carecían de una herramienta que convirtiera esa tabla en un diagrama formal en 1 clic.</w:t>
+      </w:r>
+    </w:p>
+    <w:p>
+      <w:pPr>
+        <w:spacing w:after="80" w:line="276" w:lineRule="auto"/>
+      </w:pPr>
+      <w:r>
+        <w:rPr>
+          <w:rFonts w:ascii="Calibri" w:hAnsi="Calibri"/>
+          <w:b/>
+          <w:color w:val="0F172A"/>
+          <w:sz w:val="19"/>
+        </w:rPr>
+        <w:t xml:space="preserve">• Pain Point 5: Ausencia de Control de Calidad y Riesgo de Procesos Inconclusos: </w:t>
+      </w:r>
+      <w:r>
+        <w:rPr>
+          <w:rFonts w:ascii="Calibri" w:hAnsi="Calibri"/>
+          <w:color w:val="0F172A"/>
+          <w:sz w:val="19"/>
+        </w:rPr>
+        <w:t>En las herramientas tradicionales no existe validación lógica. Con frecuencia, los diagramas aprobados contenían compuertas de decisión (rombos) sin rama de salida 'No', actividades huérfanas o procesos sin punto final, los cuales no eran descubiertos hasta auditorías regulatorias o fallas operativas.</w:t>
+      </w:r>
+    </w:p>
+    <w:p>
+      <w:pPr>
+        <w:spacing w:after="80" w:line="276" w:lineRule="auto"/>
+      </w:pPr>
+      <w:r>
+        <w:rPr>
+          <w:rFonts w:ascii="Calibri" w:hAnsi="Calibri"/>
+          <w:b/>
+          <w:color w:val="0F172A"/>
+          <w:sz w:val="19"/>
+        </w:rPr>
+        <w:t xml:space="preserve">• Pain Point 6: Fragmentación Documental y Falta de Repositorio Central: </w:t>
+      </w:r>
+      <w:r>
+        <w:rPr>
+          <w:rFonts w:ascii="Calibri" w:hAnsi="Calibri"/>
+          <w:color w:val="0F172A"/>
+          <w:sz w:val="19"/>
+        </w:rPr>
+        <w:t>Los archivos de diagramas (`.lucid`, `.vsdx`, `.drawio`) quedaban dispersos en carpetas locales o cuentas personales de diseñadores, impidiendo un control centralizado de versiones y dificultando el respaldo corporativo en Google Workspace Shared Drive.</w:t>
+      </w:r>
+    </w:p>
+    <w:p>
+      <w:pPr>
+        <w:spacing w:before="280" w:after="100"/>
+      </w:pPr>
+      <w:r>
+        <w:rPr>
+          <w:rFonts w:ascii="Calibri" w:hAnsi="Calibri"/>
+          <w:b/>
+          <w:color w:val="1E3A8A"/>
+          <w:sz w:val="26"/>
+        </w:rPr>
+        <w:t>3. Perfiles de Usuario Afectados (Personas de Procesos)</w:t>
+      </w:r>
+    </w:p>
+    <w:p>
+      <w:pPr>
+        <w:spacing w:after="80" w:line="276" w:lineRule="auto"/>
+      </w:pPr>
+      <w:r>
+        <w:rPr>
+          <w:rFonts w:ascii="Calibri" w:hAnsi="Calibri"/>
+          <w:b/>
+          <w:color w:val="0F172A"/>
+          <w:sz w:val="19"/>
+        </w:rPr>
+        <w:t xml:space="preserve">• Perfil A: Analista de Procesos y Métodos: </w:t>
+      </w:r>
+      <w:r>
+        <w:rPr>
+          <w:rFonts w:ascii="Calibri" w:hAnsi="Calibri"/>
+          <w:color w:val="0F172A"/>
+          <w:sz w:val="19"/>
+        </w:rPr>
+        <w:t>Profesional responsable de mapear la operación. Dolor: Pasa el 70% de su tiempo formateando cajas en herramientas gráficas y redactando textos repetitivos en Word.</w:t>
+      </w:r>
+    </w:p>
+    <w:p>
+      <w:pPr>
+        <w:spacing w:after="80" w:line="276" w:lineRule="auto"/>
+      </w:pPr>
+      <w:r>
+        <w:rPr>
+          <w:rFonts w:ascii="Calibri" w:hAnsi="Calibri"/>
+          <w:b/>
+          <w:color w:val="0F172A"/>
+          <w:sz w:val="19"/>
+        </w:rPr>
+        <w:t xml:space="preserve">• Perfil B: Líder de Operaciones y Dueño de Proceso (PM/PO): </w:t>
+      </w:r>
+      <w:r>
+        <w:rPr>
+          <w:rFonts w:ascii="Calibri" w:hAnsi="Calibri"/>
+          <w:color w:val="0F172A"/>
+          <w:sz w:val="19"/>
+        </w:rPr>
+        <w:t>Responsable de la eficiencia de su área. Dolor: Falta de visibilidad sobre los sistemas que soportan cada paso del flujo y demoras de semanas en recibir un manual actualizado.</w:t>
+      </w:r>
+    </w:p>
+    <w:p>
+      <w:pPr>
+        <w:spacing w:after="80" w:line="276" w:lineRule="auto"/>
+      </w:pPr>
+      <w:r>
+        <w:rPr>
+          <w:rFonts w:ascii="Calibri" w:hAnsi="Calibri"/>
+          <w:b/>
+          <w:color w:val="0F172A"/>
+          <w:sz w:val="19"/>
+        </w:rPr>
+        <w:t xml:space="preserve">• Perfil C: Auditor de Calidad y Cumplimiento: </w:t>
+      </w:r>
+      <w:r>
+        <w:rPr>
+          <w:rFonts w:ascii="Calibri" w:hAnsi="Calibri"/>
+          <w:color w:val="0F172A"/>
+          <w:sz w:val="19"/>
+        </w:rPr>
+        <w:t>Encargado de vigilar el apego normativo. Dolor: Dificultad para auditar manualmente diagramas gigantescos y encontrar caminos ciegos o inconsistencias lógicas.</w:t>
+      </w:r>
+    </w:p>
+    <w:p>
+      <w:pPr>
+        <w:spacing w:after="80" w:line="276" w:lineRule="auto"/>
+      </w:pPr>
+      <w:r>
+        <w:rPr>
+          <w:rFonts w:ascii="Calibri" w:hAnsi="Calibri"/>
+          <w:b/>
+          <w:color w:val="0F172A"/>
+          <w:sz w:val="19"/>
+        </w:rPr>
+        <w:t xml:space="preserve">• Perfil D: Asesor de Operaciones / Usuario Final: </w:t>
+      </w:r>
+      <w:r>
+        <w:rPr>
+          <w:rFonts w:ascii="Calibri" w:hAnsi="Calibri"/>
+          <w:color w:val="0F172A"/>
+          <w:sz w:val="19"/>
+        </w:rPr>
+        <w:t>Ejecuta la tarea en ventanilla o atención al cliente. Dolor: Recibe procedimientos desactualizados o diagramas confusos que no indican qué pantalla de Chronos abrir.</w:t>
+      </w:r>
+    </w:p>
+    <w:p>
+      <w:pPr>
+        <w:spacing w:before="280" w:after="100"/>
+      </w:pPr>
+      <w:r>
+        <w:rPr>
+          <w:rFonts w:ascii="Calibri" w:hAnsi="Calibri"/>
+          <w:b/>
+          <w:color w:val="1E3A8A"/>
+          <w:sz w:val="26"/>
+        </w:rPr>
+        <w:t>4. Mapa de Experiencia Actual (Customer Journey Map de Documentación)</w:t>
+      </w:r>
+    </w:p>
+    <w:p>
+      <w:pPr>
+        <w:spacing w:after="80" w:line="276" w:lineRule="auto"/>
+      </w:pPr>
+      <w:r>
+        <w:rPr>
+          <w:rFonts w:ascii="Calibri" w:hAnsi="Calibri"/>
+          <w:color w:val="0F172A"/>
+          <w:sz w:val="19"/>
+        </w:rPr>
+        <w:t>Análisis de las 6 etapas del ciclo de vida de un proceso bajo el modelo tradicional (AS-IS):</w:t>
+      </w:r>
+    </w:p>
+    <w:tbl>
+      <w:tblPr>
+        <w:tblW w:type="auto" w:w="0"/>
+        <w:jc w:val="center"/>
+        <w:tblLayout w:type="fixed"/>
+        <w:tblLook w:firstColumn="1" w:firstRow="1" w:lastColumn="0" w:lastRow="0" w:noHBand="0" w:noVBand="1" w:val="04A0"/>
+      </w:tblPr>
+      <w:tblGrid>
+        <w:gridCol w:w="1440"/>
+        <w:gridCol w:w="1440"/>
+        <w:gridCol w:w="1440"/>
+        <w:gridCol w:w="1440"/>
+        <w:gridCol w:w="1440"/>
+        <w:gridCol w:w="1440"/>
+      </w:tblGrid>
+      <w:tr>
+        <w:tc>
+          <w:tcPr>
+            <w:tcW w:type="dxa" w:w="1872"/>
+            <w:shd w:fill="1E3A8A"/>
+            <w:tcMar>
+              <w:top w:w="90" w:type="dxa"/>
+              <w:bottom w:w="90" w:type="dxa"/>
               <w:left w:w="100" w:type="dxa"/>
               <w:right w:w="100" w:type="dxa"/>
             </w:tcMar>
@@ -74,42 +712,20 @@
               <w:rPr>
                 <w:rFonts w:ascii="Calibri" w:hAnsi="Calibri"/>
                 <w:b/>
-                <w:color w:val="1E3A8A"/>
+                <w:color w:val="FFFFFF"/>
                 <w:sz w:val="18"/>
               </w:rPr>
-              <w:t>Proyecto:</w:t>
+              <w:t>Etapa del Proceso</w:t>
             </w:r>
           </w:p>
         </w:tc>
         <w:tc>
           <w:tcPr>
-            <w:tcW w:type="dxa" w:w="2160"/>
-            <w:shd w:fill="FFFFFF"/>
+            <w:tcW w:type="dxa" w:w="2016"/>
+            <w:shd w:fill="1E3A8A"/>
             <w:tcMar>
-              <w:top w:w="80" w:type="dxa"/>
-              <w:bottom w:w="80" w:type="dxa"/>
-              <w:left w:w="100" w:type="dxa"/>
-              <w:right w:w="100" w:type="dxa"/>
-            </w:tcMar>
-          </w:tcPr>
-          <w:p>
-            <w:r>
-              <w:rPr>
-                <w:rFonts w:ascii="Calibri" w:hAnsi="Calibri"/>
-                <w:color w:val="0F172A"/>
-                <w:sz w:val="18"/>
-              </w:rPr>
-              <w:t>TEMIS (Process Suite &amp; Governance)</w:t>
-            </w:r>
-          </w:p>
-        </w:tc>
-        <w:tc>
-          <w:tcPr>
-            <w:tcW w:type="dxa" w:w="2160"/>
-            <w:shd w:fill="F8FAFC"/>
-            <w:tcMar>
-              <w:top w:w="80" w:type="dxa"/>
-              <w:bottom w:w="80" w:type="dxa"/>
+              <w:top w:w="90" w:type="dxa"/>
+              <w:bottom w:w="90" w:type="dxa"/>
               <w:left w:w="100" w:type="dxa"/>
               <w:right w:w="100" w:type="dxa"/>
             </w:tcMar>
@@ -119,20 +735,20 @@
               <w:rPr>
                 <w:rFonts w:ascii="Calibri" w:hAnsi="Calibri"/>
                 <w:b/>
-                <w:color w:val="1E3A8A"/>
+                <w:color w:val="FFFFFF"/>
                 <w:sz w:val="18"/>
               </w:rPr>
-              <w:t>Periodo:</w:t>
+              <w:t>Objetivo del Usuario</w:t>
             </w:r>
           </w:p>
         </w:tc>
         <w:tc>
           <w:tcPr>
-            <w:tcW w:type="dxa" w:w="2160"/>
-            <w:shd w:fill="FFFFFF"/>
+            <w:tcW w:type="dxa" w:w="2016"/>
+            <w:shd w:fill="1E3A8A"/>
             <w:tcMar>
-              <w:top w:w="80" w:type="dxa"/>
-              <w:bottom w:w="80" w:type="dxa"/>
+              <w:top w:w="90" w:type="dxa"/>
+              <w:bottom w:w="90" w:type="dxa"/>
               <w:left w:w="100" w:type="dxa"/>
               <w:right w:w="100" w:type="dxa"/>
             </w:tcMar>
@@ -141,10 +757,1108 @@
             <w:r>
               <w:rPr>
                 <w:rFonts w:ascii="Calibri" w:hAnsi="Calibri"/>
-                <w:color w:val="0F172A"/>
+                <w:b/>
+                <w:color w:val="FFFFFF"/>
                 <w:sz w:val="18"/>
               </w:rPr>
-              <w:t>Enero 2026 – Diciembre 2026</w:t>
+              <w:t>Acción Realizada (AS-IS)</w:t>
+            </w:r>
+          </w:p>
+        </w:tc>
+        <w:tc>
+          <w:tcPr>
+            <w:tcW w:type="dxa" w:w="1584"/>
+            <w:shd w:fill="1E3A8A"/>
+            <w:tcMar>
+              <w:top w:w="90" w:type="dxa"/>
+              <w:bottom w:w="90" w:type="dxa"/>
+              <w:left w:w="100" w:type="dxa"/>
+              <w:right w:w="100" w:type="dxa"/>
+            </w:tcMar>
+          </w:tcPr>
+          <w:p>
+            <w:r>
+              <w:rPr>
+                <w:rFonts w:ascii="Calibri" w:hAnsi="Calibri"/>
+                <w:b/>
+                <w:color w:val="FFFFFF"/>
+                <w:sz w:val="18"/>
+              </w:rPr>
+              <w:t>Punto de Contacto</w:t>
+            </w:r>
+          </w:p>
+        </w:tc>
+        <w:tc>
+          <w:tcPr>
+            <w:tcW w:type="dxa" w:w="1584"/>
+            <w:shd w:fill="1E3A8A"/>
+            <w:tcMar>
+              <w:top w:w="90" w:type="dxa"/>
+              <w:bottom w:w="90" w:type="dxa"/>
+              <w:left w:w="100" w:type="dxa"/>
+              <w:right w:w="100" w:type="dxa"/>
+            </w:tcMar>
+          </w:tcPr>
+          <w:p>
+            <w:r>
+              <w:rPr>
+                <w:rFonts w:ascii="Calibri" w:hAnsi="Calibri"/>
+                <w:b/>
+                <w:color w:val="FFFFFF"/>
+                <w:sz w:val="18"/>
+              </w:rPr>
+              <w:t>Nivel de Fricción</w:t>
+            </w:r>
+          </w:p>
+        </w:tc>
+        <w:tc>
+          <w:tcPr>
+            <w:tcW w:type="dxa" w:w="2016"/>
+            <w:shd w:fill="1E3A8A"/>
+            <w:tcMar>
+              <w:top w:w="90" w:type="dxa"/>
+              <w:bottom w:w="90" w:type="dxa"/>
+              <w:left w:w="100" w:type="dxa"/>
+              <w:right w:w="100" w:type="dxa"/>
+            </w:tcMar>
+          </w:tcPr>
+          <w:p>
+            <w:r>
+              <w:rPr>
+                <w:rFonts w:ascii="Calibri" w:hAnsi="Calibri"/>
+                <w:b/>
+                <w:color w:val="FFFFFF"/>
+                <w:sz w:val="18"/>
+              </w:rPr>
+              <w:t>Oportunidad TEMIS</w:t>
+            </w:r>
+          </w:p>
+        </w:tc>
+      </w:tr>
+      <w:tr>
+        <w:tc>
+          <w:tcPr>
+            <w:tcW w:type="dxa" w:w="1872"/>
+            <w:shd w:fill="FFFFFF"/>
+            <w:tcMar>
+              <w:top w:w="70" w:type="dxa"/>
+              <w:bottom w:w="70" w:type="dxa"/>
+              <w:left w:w="90" w:type="dxa"/>
+              <w:right w:w="90" w:type="dxa"/>
+            </w:tcMar>
+          </w:tcPr>
+          <w:p>
+            <w:r>
+              <w:rPr>
+                <w:rFonts w:ascii="Calibri" w:hAnsi="Calibri"/>
+                <w:b/>
+                <w:color w:val="1E3A8A"/>
+                <w:sz w:val="17"/>
+              </w:rPr>
+              <w:t>1. Captura de Requerimientos</w:t>
+            </w:r>
+          </w:p>
+        </w:tc>
+        <w:tc>
+          <w:tcPr>
+            <w:tcW w:type="dxa" w:w="2016"/>
+            <w:shd w:fill="FFFFFF"/>
+            <w:tcMar>
+              <w:top w:w="70" w:type="dxa"/>
+              <w:bottom w:w="70" w:type="dxa"/>
+              <w:left w:w="90" w:type="dxa"/>
+              <w:right w:w="90" w:type="dxa"/>
+            </w:tcMar>
+          </w:tcPr>
+          <w:p>
+            <w:r>
+              <w:rPr>
+                <w:rFonts w:ascii="Calibri" w:hAnsi="Calibri"/>
+                <w:color w:val="0F172A"/>
+                <w:sz w:val="17"/>
+              </w:rPr>
+              <w:t>Recopilar pasos del proceso con el área operativa.</w:t>
+            </w:r>
+          </w:p>
+        </w:tc>
+        <w:tc>
+          <w:tcPr>
+            <w:tcW w:type="dxa" w:w="2016"/>
+            <w:shd w:fill="FFFFFF"/>
+            <w:tcMar>
+              <w:top w:w="70" w:type="dxa"/>
+              <w:bottom w:w="70" w:type="dxa"/>
+              <w:left w:w="90" w:type="dxa"/>
+              <w:right w:w="90" w:type="dxa"/>
+            </w:tcMar>
+          </w:tcPr>
+          <w:p>
+            <w:r>
+              <w:rPr>
+                <w:rFonts w:ascii="Calibri" w:hAnsi="Calibri"/>
+                <w:color w:val="0F172A"/>
+                <w:sz w:val="17"/>
+              </w:rPr>
+              <w:t>Entrevistas y notas en Excel o blocs de notas.</w:t>
+            </w:r>
+          </w:p>
+        </w:tc>
+        <w:tc>
+          <w:tcPr>
+            <w:tcW w:type="dxa" w:w="1584"/>
+            <w:shd w:fill="FFFFFF"/>
+            <w:tcMar>
+              <w:top w:w="70" w:type="dxa"/>
+              <w:bottom w:w="70" w:type="dxa"/>
+              <w:left w:w="90" w:type="dxa"/>
+              <w:right w:w="90" w:type="dxa"/>
+            </w:tcMar>
+          </w:tcPr>
+          <w:p>
+            <w:r>
+              <w:rPr>
+                <w:rFonts w:ascii="Calibri" w:hAnsi="Calibri"/>
+                <w:color w:val="0F172A"/>
+                <w:sz w:val="17"/>
+              </w:rPr>
+              <w:t>Reuniones / Excel</w:t>
+            </w:r>
+          </w:p>
+        </w:tc>
+        <w:tc>
+          <w:tcPr>
+            <w:tcW w:type="dxa" w:w="1584"/>
+            <w:shd w:fill="FFFFFF"/>
+            <w:tcMar>
+              <w:top w:w="70" w:type="dxa"/>
+              <w:bottom w:w="70" w:type="dxa"/>
+              <w:left w:w="90" w:type="dxa"/>
+              <w:right w:w="90" w:type="dxa"/>
+            </w:tcMar>
+          </w:tcPr>
+          <w:p>
+            <w:r>
+              <w:rPr>
+                <w:rFonts w:ascii="Calibri" w:hAnsi="Calibri"/>
+                <w:color w:val="0F172A"/>
+                <w:sz w:val="17"/>
+              </w:rPr>
+              <w:t>Medio</w:t>
+            </w:r>
+          </w:p>
+        </w:tc>
+        <w:tc>
+          <w:tcPr>
+            <w:tcW w:type="dxa" w:w="2016"/>
+            <w:shd w:fill="FFFFFF"/>
+            <w:tcMar>
+              <w:top w:w="70" w:type="dxa"/>
+              <w:bottom w:w="70" w:type="dxa"/>
+              <w:left w:w="90" w:type="dxa"/>
+              <w:right w:w="90" w:type="dxa"/>
+            </w:tcMar>
+          </w:tcPr>
+          <w:p>
+            <w:r>
+              <w:rPr>
+                <w:rFonts w:ascii="Calibri" w:hAnsi="Calibri"/>
+                <w:color w:val="0F172A"/>
+                <w:sz w:val="17"/>
+              </w:rPr>
+              <w:t>Plantilla SIPOC estructurada interactiva.</w:t>
+            </w:r>
+          </w:p>
+        </w:tc>
+      </w:tr>
+      <w:tr>
+        <w:tc>
+          <w:tcPr>
+            <w:tcW w:type="dxa" w:w="1872"/>
+            <w:shd w:fill="F8FAFC"/>
+            <w:tcMar>
+              <w:top w:w="70" w:type="dxa"/>
+              <w:bottom w:w="70" w:type="dxa"/>
+              <w:left w:w="90" w:type="dxa"/>
+              <w:right w:w="90" w:type="dxa"/>
+            </w:tcMar>
+          </w:tcPr>
+          <w:p>
+            <w:r>
+              <w:rPr>
+                <w:rFonts w:ascii="Calibri" w:hAnsi="Calibri"/>
+                <w:b/>
+                <w:color w:val="1E3A8A"/>
+                <w:sz w:val="17"/>
+              </w:rPr>
+              <w:t>2. Diagramación Visual</w:t>
+            </w:r>
+          </w:p>
+        </w:tc>
+        <w:tc>
+          <w:tcPr>
+            <w:tcW w:type="dxa" w:w="2016"/>
+            <w:shd w:fill="F8FAFC"/>
+            <w:tcMar>
+              <w:top w:w="70" w:type="dxa"/>
+              <w:bottom w:w="70" w:type="dxa"/>
+              <w:left w:w="90" w:type="dxa"/>
+              <w:right w:w="90" w:type="dxa"/>
+            </w:tcMar>
+          </w:tcPr>
+          <w:p>
+            <w:r>
+              <w:rPr>
+                <w:rFonts w:ascii="Calibri" w:hAnsi="Calibri"/>
+                <w:color w:val="0F172A"/>
+                <w:sz w:val="17"/>
+              </w:rPr>
+              <w:t>Crear el flujo gráfico de decisión y tareas.</w:t>
+            </w:r>
+          </w:p>
+        </w:tc>
+        <w:tc>
+          <w:tcPr>
+            <w:tcW w:type="dxa" w:w="2016"/>
+            <w:shd w:fill="F8FAFC"/>
+            <w:tcMar>
+              <w:top w:w="70" w:type="dxa"/>
+              <w:bottom w:w="70" w:type="dxa"/>
+              <w:left w:w="90" w:type="dxa"/>
+              <w:right w:w="90" w:type="dxa"/>
+            </w:tcMar>
+          </w:tcPr>
+          <w:p>
+            <w:r>
+              <w:rPr>
+                <w:rFonts w:ascii="Calibri" w:hAnsi="Calibri"/>
+                <w:color w:val="0F172A"/>
+                <w:sz w:val="17"/>
+              </w:rPr>
+              <w:t>Arrastrar cajas manualmente en Lucidchart.</w:t>
+            </w:r>
+          </w:p>
+        </w:tc>
+        <w:tc>
+          <w:tcPr>
+            <w:tcW w:type="dxa" w:w="1584"/>
+            <w:shd w:fill="F8FAFC"/>
+            <w:tcMar>
+              <w:top w:w="70" w:type="dxa"/>
+              <w:bottom w:w="70" w:type="dxa"/>
+              <w:left w:w="90" w:type="dxa"/>
+              <w:right w:w="90" w:type="dxa"/>
+            </w:tcMar>
+          </w:tcPr>
+          <w:p>
+            <w:r>
+              <w:rPr>
+                <w:rFonts w:ascii="Calibri" w:hAnsi="Calibri"/>
+                <w:color w:val="0F172A"/>
+                <w:sz w:val="17"/>
+              </w:rPr>
+              <w:t>Lucidchart SaaS</w:t>
+            </w:r>
+          </w:p>
+        </w:tc>
+        <w:tc>
+          <w:tcPr>
+            <w:tcW w:type="dxa" w:w="1584"/>
+            <w:shd w:fill="F8FAFC"/>
+            <w:tcMar>
+              <w:top w:w="70" w:type="dxa"/>
+              <w:bottom w:w="70" w:type="dxa"/>
+              <w:left w:w="90" w:type="dxa"/>
+              <w:right w:w="90" w:type="dxa"/>
+            </w:tcMar>
+          </w:tcPr>
+          <w:p>
+            <w:r>
+              <w:rPr>
+                <w:rFonts w:ascii="Calibri" w:hAnsi="Calibri"/>
+                <w:color w:val="0F172A"/>
+                <w:sz w:val="17"/>
+              </w:rPr>
+              <w:t>Alto (Licencia)</w:t>
+            </w:r>
+          </w:p>
+        </w:tc>
+        <w:tc>
+          <w:tcPr>
+            <w:tcW w:type="dxa" w:w="2016"/>
+            <w:shd w:fill="F8FAFC"/>
+            <w:tcMar>
+              <w:top w:w="70" w:type="dxa"/>
+              <w:bottom w:w="70" w:type="dxa"/>
+              <w:left w:w="90" w:type="dxa"/>
+              <w:right w:w="90" w:type="dxa"/>
+            </w:tcMar>
+          </w:tcPr>
+          <w:p>
+            <w:r>
+              <w:rPr>
+                <w:rFonts w:ascii="Calibri" w:hAnsi="Calibri"/>
+                <w:color w:val="0F172A"/>
+                <w:sz w:val="17"/>
+              </w:rPr>
+              <w:t>Generador automático Bézier desde SIPOC.</w:t>
+            </w:r>
+          </w:p>
+        </w:tc>
+      </w:tr>
+      <w:tr>
+        <w:tc>
+          <w:tcPr>
+            <w:tcW w:type="dxa" w:w="1872"/>
+            <w:shd w:fill="FFFFFF"/>
+            <w:tcMar>
+              <w:top w:w="70" w:type="dxa"/>
+              <w:bottom w:w="70" w:type="dxa"/>
+              <w:left w:w="90" w:type="dxa"/>
+              <w:right w:w="90" w:type="dxa"/>
+            </w:tcMar>
+          </w:tcPr>
+          <w:p>
+            <w:r>
+              <w:rPr>
+                <w:rFonts w:ascii="Calibri" w:hAnsi="Calibri"/>
+                <w:b/>
+                <w:color w:val="1E3A8A"/>
+                <w:sz w:val="17"/>
+              </w:rPr>
+              <w:t>3. Redacción del Manual</w:t>
+            </w:r>
+          </w:p>
+        </w:tc>
+        <w:tc>
+          <w:tcPr>
+            <w:tcW w:type="dxa" w:w="2016"/>
+            <w:shd w:fill="FFFFFF"/>
+            <w:tcMar>
+              <w:top w:w="70" w:type="dxa"/>
+              <w:bottom w:w="70" w:type="dxa"/>
+              <w:left w:w="90" w:type="dxa"/>
+              <w:right w:w="90" w:type="dxa"/>
+            </w:tcMar>
+          </w:tcPr>
+          <w:p>
+            <w:r>
+              <w:rPr>
+                <w:rFonts w:ascii="Calibri" w:hAnsi="Calibri"/>
+                <w:color w:val="0F172A"/>
+                <w:sz w:val="17"/>
+              </w:rPr>
+              <w:t>Generar el documento oficial de políticas.</w:t>
+            </w:r>
+          </w:p>
+        </w:tc>
+        <w:tc>
+          <w:tcPr>
+            <w:tcW w:type="dxa" w:w="2016"/>
+            <w:shd w:fill="FFFFFF"/>
+            <w:tcMar>
+              <w:top w:w="70" w:type="dxa"/>
+              <w:bottom w:w="70" w:type="dxa"/>
+              <w:left w:w="90" w:type="dxa"/>
+              <w:right w:w="90" w:type="dxa"/>
+            </w:tcMar>
+          </w:tcPr>
+          <w:p>
+            <w:r>
+              <w:rPr>
+                <w:rFonts w:ascii="Calibri" w:hAnsi="Calibri"/>
+                <w:color w:val="0F172A"/>
+                <w:sz w:val="17"/>
+              </w:rPr>
+              <w:t>Redactar 20 páginas en Word desde cero.</w:t>
+            </w:r>
+          </w:p>
+        </w:tc>
+        <w:tc>
+          <w:tcPr>
+            <w:tcW w:type="dxa" w:w="1584"/>
+            <w:shd w:fill="FFFFFF"/>
+            <w:tcMar>
+              <w:top w:w="70" w:type="dxa"/>
+              <w:bottom w:w="70" w:type="dxa"/>
+              <w:left w:w="90" w:type="dxa"/>
+              <w:right w:w="90" w:type="dxa"/>
+            </w:tcMar>
+          </w:tcPr>
+          <w:p>
+            <w:r>
+              <w:rPr>
+                <w:rFonts w:ascii="Calibri" w:hAnsi="Calibri"/>
+                <w:color w:val="0F172A"/>
+                <w:sz w:val="17"/>
+              </w:rPr>
+              <w:t>MS Word local</w:t>
+            </w:r>
+          </w:p>
+        </w:tc>
+        <w:tc>
+          <w:tcPr>
+            <w:tcW w:type="dxa" w:w="1584"/>
+            <w:shd w:fill="FFFFFF"/>
+            <w:tcMar>
+              <w:top w:w="70" w:type="dxa"/>
+              <w:bottom w:w="70" w:type="dxa"/>
+              <w:left w:w="90" w:type="dxa"/>
+              <w:right w:w="90" w:type="dxa"/>
+            </w:tcMar>
+          </w:tcPr>
+          <w:p>
+            <w:r>
+              <w:rPr>
+                <w:rFonts w:ascii="Calibri" w:hAnsi="Calibri"/>
+                <w:color w:val="0F172A"/>
+                <w:sz w:val="17"/>
+              </w:rPr>
+              <w:t>Crítico (20-40h)</w:t>
+            </w:r>
+          </w:p>
+        </w:tc>
+        <w:tc>
+          <w:tcPr>
+            <w:tcW w:type="dxa" w:w="2016"/>
+            <w:shd w:fill="FFFFFF"/>
+            <w:tcMar>
+              <w:top w:w="70" w:type="dxa"/>
+              <w:bottom w:w="70" w:type="dxa"/>
+              <w:left w:w="90" w:type="dxa"/>
+              <w:right w:w="90" w:type="dxa"/>
+            </w:tcMar>
+          </w:tcPr>
+          <w:p>
+            <w:r>
+              <w:rPr>
+                <w:rFonts w:ascii="Calibri" w:hAnsi="Calibri"/>
+                <w:color w:val="0F172A"/>
+                <w:sz w:val="17"/>
+              </w:rPr>
+              <w:t>Redacción automática con Gemini 2.5 Flash.</w:t>
+            </w:r>
+          </w:p>
+        </w:tc>
+      </w:tr>
+      <w:tr>
+        <w:tc>
+          <w:tcPr>
+            <w:tcW w:type="dxa" w:w="1872"/>
+            <w:shd w:fill="F8FAFC"/>
+            <w:tcMar>
+              <w:top w:w="70" w:type="dxa"/>
+              <w:bottom w:w="70" w:type="dxa"/>
+              <w:left w:w="90" w:type="dxa"/>
+              <w:right w:w="90" w:type="dxa"/>
+            </w:tcMar>
+          </w:tcPr>
+          <w:p>
+            <w:r>
+              <w:rPr>
+                <w:rFonts w:ascii="Calibri" w:hAnsi="Calibri"/>
+                <w:b/>
+                <w:color w:val="1E3A8A"/>
+                <w:sz w:val="17"/>
+              </w:rPr>
+              <w:t>4. Auditoría de Calidad</w:t>
+            </w:r>
+          </w:p>
+        </w:tc>
+        <w:tc>
+          <w:tcPr>
+            <w:tcW w:type="dxa" w:w="2016"/>
+            <w:shd w:fill="F8FAFC"/>
+            <w:tcMar>
+              <w:top w:w="70" w:type="dxa"/>
+              <w:bottom w:w="70" w:type="dxa"/>
+              <w:left w:w="90" w:type="dxa"/>
+              <w:right w:w="90" w:type="dxa"/>
+            </w:tcMar>
+          </w:tcPr>
+          <w:p>
+            <w:r>
+              <w:rPr>
+                <w:rFonts w:ascii="Calibri" w:hAnsi="Calibri"/>
+                <w:color w:val="0F172A"/>
+                <w:sz w:val="17"/>
+              </w:rPr>
+              <w:t>Verificar que el flujo no tenga errores lógicos.</w:t>
+            </w:r>
+          </w:p>
+        </w:tc>
+        <w:tc>
+          <w:tcPr>
+            <w:tcW w:type="dxa" w:w="2016"/>
+            <w:shd w:fill="F8FAFC"/>
+            <w:tcMar>
+              <w:top w:w="70" w:type="dxa"/>
+              <w:bottom w:w="70" w:type="dxa"/>
+              <w:left w:w="90" w:type="dxa"/>
+              <w:right w:w="90" w:type="dxa"/>
+            </w:tcMar>
+          </w:tcPr>
+          <w:p>
+            <w:r>
+              <w:rPr>
+                <w:rFonts w:ascii="Calibri" w:hAnsi="Calibri"/>
+                <w:color w:val="0F172A"/>
+                <w:sz w:val="17"/>
+              </w:rPr>
+              <w:t>Revisión visual manual regla por regla.</w:t>
+            </w:r>
+          </w:p>
+        </w:tc>
+        <w:tc>
+          <w:tcPr>
+            <w:tcW w:type="dxa" w:w="1584"/>
+            <w:shd w:fill="F8FAFC"/>
+            <w:tcMar>
+              <w:top w:w="70" w:type="dxa"/>
+              <w:bottom w:w="70" w:type="dxa"/>
+              <w:left w:w="90" w:type="dxa"/>
+              <w:right w:w="90" w:type="dxa"/>
+            </w:tcMar>
+          </w:tcPr>
+          <w:p>
+            <w:r>
+              <w:rPr>
+                <w:rFonts w:ascii="Calibri" w:hAnsi="Calibri"/>
+                <w:color w:val="0F172A"/>
+                <w:sz w:val="17"/>
+              </w:rPr>
+              <w:t>Revisión por pares</w:t>
+            </w:r>
+          </w:p>
+        </w:tc>
+        <w:tc>
+          <w:tcPr>
+            <w:tcW w:type="dxa" w:w="1584"/>
+            <w:shd w:fill="F8FAFC"/>
+            <w:tcMar>
+              <w:top w:w="70" w:type="dxa"/>
+              <w:bottom w:w="70" w:type="dxa"/>
+              <w:left w:w="90" w:type="dxa"/>
+              <w:right w:w="90" w:type="dxa"/>
+            </w:tcMar>
+          </w:tcPr>
+          <w:p>
+            <w:r>
+              <w:rPr>
+                <w:rFonts w:ascii="Calibri" w:hAnsi="Calibri"/>
+                <w:color w:val="0F172A"/>
+                <w:sz w:val="17"/>
+              </w:rPr>
+              <w:t>Alto (Errores)</w:t>
+            </w:r>
+          </w:p>
+        </w:tc>
+        <w:tc>
+          <w:tcPr>
+            <w:tcW w:type="dxa" w:w="2016"/>
+            <w:shd w:fill="F8FAFC"/>
+            <w:tcMar>
+              <w:top w:w="70" w:type="dxa"/>
+              <w:bottom w:w="70" w:type="dxa"/>
+              <w:left w:w="90" w:type="dxa"/>
+              <w:right w:w="90" w:type="dxa"/>
+            </w:tcMar>
+          </w:tcPr>
+          <w:p>
+            <w:r>
+              <w:rPr>
+                <w:rFonts w:ascii="Calibri" w:hAnsi="Calibri"/>
+                <w:color w:val="0F172A"/>
+                <w:sz w:val="17"/>
+              </w:rPr>
+              <w:t>Auditor IA en tiempo real (Score 0-100).</w:t>
+            </w:r>
+          </w:p>
+        </w:tc>
+      </w:tr>
+      <w:tr>
+        <w:tc>
+          <w:tcPr>
+            <w:tcW w:type="dxa" w:w="1872"/>
+            <w:shd w:fill="FFFFFF"/>
+            <w:tcMar>
+              <w:top w:w="70" w:type="dxa"/>
+              <w:bottom w:w="70" w:type="dxa"/>
+              <w:left w:w="90" w:type="dxa"/>
+              <w:right w:w="90" w:type="dxa"/>
+            </w:tcMar>
+          </w:tcPr>
+          <w:p>
+            <w:r>
+              <w:rPr>
+                <w:rFonts w:ascii="Calibri" w:hAnsi="Calibri"/>
+                <w:b/>
+                <w:color w:val="1E3A8A"/>
+                <w:sz w:val="17"/>
+              </w:rPr>
+              <w:t>5. Aprobación &amp; Firma</w:t>
+            </w:r>
+          </w:p>
+        </w:tc>
+        <w:tc>
+          <w:tcPr>
+            <w:tcW w:type="dxa" w:w="2016"/>
+            <w:shd w:fill="FFFFFF"/>
+            <w:tcMar>
+              <w:top w:w="70" w:type="dxa"/>
+              <w:bottom w:w="70" w:type="dxa"/>
+              <w:left w:w="90" w:type="dxa"/>
+              <w:right w:w="90" w:type="dxa"/>
+            </w:tcMar>
+          </w:tcPr>
+          <w:p>
+            <w:r>
+              <w:rPr>
+                <w:rFonts w:ascii="Calibri" w:hAnsi="Calibri"/>
+                <w:color w:val="0F172A"/>
+                <w:sz w:val="17"/>
+              </w:rPr>
+              <w:t>Obtener sign-off del Sponsor y Líder de Área.</w:t>
+            </w:r>
+          </w:p>
+        </w:tc>
+        <w:tc>
+          <w:tcPr>
+            <w:tcW w:type="dxa" w:w="2016"/>
+            <w:shd w:fill="FFFFFF"/>
+            <w:tcMar>
+              <w:top w:w="70" w:type="dxa"/>
+              <w:bottom w:w="70" w:type="dxa"/>
+              <w:left w:w="90" w:type="dxa"/>
+              <w:right w:w="90" w:type="dxa"/>
+            </w:tcMar>
+          </w:tcPr>
+          <w:p>
+            <w:r>
+              <w:rPr>
+                <w:rFonts w:ascii="Calibri" w:hAnsi="Calibri"/>
+                <w:color w:val="0F172A"/>
+                <w:sz w:val="17"/>
+              </w:rPr>
+              <w:t>Envío de PDFs por correo con firmas manuales.</w:t>
+            </w:r>
+          </w:p>
+        </w:tc>
+        <w:tc>
+          <w:tcPr>
+            <w:tcW w:type="dxa" w:w="1584"/>
+            <w:shd w:fill="FFFFFF"/>
+            <w:tcMar>
+              <w:top w:w="70" w:type="dxa"/>
+              <w:bottom w:w="70" w:type="dxa"/>
+              <w:left w:w="90" w:type="dxa"/>
+              <w:right w:w="90" w:type="dxa"/>
+            </w:tcMar>
+          </w:tcPr>
+          <w:p>
+            <w:r>
+              <w:rPr>
+                <w:rFonts w:ascii="Calibri" w:hAnsi="Calibri"/>
+                <w:color w:val="0F172A"/>
+                <w:sz w:val="17"/>
+              </w:rPr>
+              <w:t>Correo electrónico</w:t>
+            </w:r>
+          </w:p>
+        </w:tc>
+        <w:tc>
+          <w:tcPr>
+            <w:tcW w:type="dxa" w:w="1584"/>
+            <w:shd w:fill="FFFFFF"/>
+            <w:tcMar>
+              <w:top w:w="70" w:type="dxa"/>
+              <w:bottom w:w="70" w:type="dxa"/>
+              <w:left w:w="90" w:type="dxa"/>
+              <w:right w:w="90" w:type="dxa"/>
+            </w:tcMar>
+          </w:tcPr>
+          <w:p>
+            <w:r>
+              <w:rPr>
+                <w:rFonts w:ascii="Calibri" w:hAnsi="Calibri"/>
+                <w:color w:val="0F172A"/>
+                <w:sz w:val="17"/>
+              </w:rPr>
+              <w:t>Medio</w:t>
+            </w:r>
+          </w:p>
+        </w:tc>
+        <w:tc>
+          <w:tcPr>
+            <w:tcW w:type="dxa" w:w="2016"/>
+            <w:shd w:fill="FFFFFF"/>
+            <w:tcMar>
+              <w:top w:w="70" w:type="dxa"/>
+              <w:bottom w:w="70" w:type="dxa"/>
+              <w:left w:w="90" w:type="dxa"/>
+              <w:right w:w="90" w:type="dxa"/>
+            </w:tcMar>
+          </w:tcPr>
+          <w:p>
+            <w:r>
+              <w:rPr>
+                <w:rFonts w:ascii="Calibri" w:hAnsi="Calibri"/>
+                <w:color w:val="0F172A"/>
+                <w:sz w:val="17"/>
+              </w:rPr>
+              <w:t>Módulo de Gobernanza y Actas integrado.</w:t>
+            </w:r>
+          </w:p>
+        </w:tc>
+      </w:tr>
+      <w:tr>
+        <w:tc>
+          <w:tcPr>
+            <w:tcW w:type="dxa" w:w="1872"/>
+            <w:shd w:fill="F8FAFC"/>
+            <w:tcMar>
+              <w:top w:w="70" w:type="dxa"/>
+              <w:bottom w:w="70" w:type="dxa"/>
+              <w:left w:w="90" w:type="dxa"/>
+              <w:right w:w="90" w:type="dxa"/>
+            </w:tcMar>
+          </w:tcPr>
+          <w:p>
+            <w:r>
+              <w:rPr>
+                <w:rFonts w:ascii="Calibri" w:hAnsi="Calibri"/>
+                <w:b/>
+                <w:color w:val="1E3A8A"/>
+                <w:sz w:val="17"/>
+              </w:rPr>
+              <w:t>6. Publicación y Respaldo</w:t>
+            </w:r>
+          </w:p>
+        </w:tc>
+        <w:tc>
+          <w:tcPr>
+            <w:tcW w:type="dxa" w:w="2016"/>
+            <w:shd w:fill="F8FAFC"/>
+            <w:tcMar>
+              <w:top w:w="70" w:type="dxa"/>
+              <w:bottom w:w="70" w:type="dxa"/>
+              <w:left w:w="90" w:type="dxa"/>
+              <w:right w:w="90" w:type="dxa"/>
+            </w:tcMar>
+          </w:tcPr>
+          <w:p>
+            <w:r>
+              <w:rPr>
+                <w:rFonts w:ascii="Calibri" w:hAnsi="Calibri"/>
+                <w:color w:val="0F172A"/>
+                <w:sz w:val="17"/>
+              </w:rPr>
+              <w:t>Almacenar versión oficial y compartir al equipo.</w:t>
+            </w:r>
+          </w:p>
+        </w:tc>
+        <w:tc>
+          <w:tcPr>
+            <w:tcW w:type="dxa" w:w="2016"/>
+            <w:shd w:fill="F8FAFC"/>
+            <w:tcMar>
+              <w:top w:w="70" w:type="dxa"/>
+              <w:bottom w:w="70" w:type="dxa"/>
+              <w:left w:w="90" w:type="dxa"/>
+              <w:right w:w="90" w:type="dxa"/>
+            </w:tcMar>
+          </w:tcPr>
+          <w:p>
+            <w:r>
+              <w:rPr>
+                <w:rFonts w:ascii="Calibri" w:hAnsi="Calibri"/>
+                <w:color w:val="0F172A"/>
+                <w:sz w:val="17"/>
+              </w:rPr>
+              <w:t>Guardado en carpetas locales o nubes personales.</w:t>
+            </w:r>
+          </w:p>
+        </w:tc>
+        <w:tc>
+          <w:tcPr>
+            <w:tcW w:type="dxa" w:w="1584"/>
+            <w:shd w:fill="F8FAFC"/>
+            <w:tcMar>
+              <w:top w:w="70" w:type="dxa"/>
+              <w:bottom w:w="70" w:type="dxa"/>
+              <w:left w:w="90" w:type="dxa"/>
+              <w:right w:w="90" w:type="dxa"/>
+            </w:tcMar>
+          </w:tcPr>
+          <w:p>
+            <w:r>
+              <w:rPr>
+                <w:rFonts w:ascii="Calibri" w:hAnsi="Calibri"/>
+                <w:color w:val="0F172A"/>
+                <w:sz w:val="17"/>
+              </w:rPr>
+              <w:t>Discos locales</w:t>
+            </w:r>
+          </w:p>
+        </w:tc>
+        <w:tc>
+          <w:tcPr>
+            <w:tcW w:type="dxa" w:w="1584"/>
+            <w:shd w:fill="F8FAFC"/>
+            <w:tcMar>
+              <w:top w:w="70" w:type="dxa"/>
+              <w:bottom w:w="70" w:type="dxa"/>
+              <w:left w:w="90" w:type="dxa"/>
+              <w:right w:w="90" w:type="dxa"/>
+            </w:tcMar>
+          </w:tcPr>
+          <w:p>
+            <w:r>
+              <w:rPr>
+                <w:rFonts w:ascii="Calibri" w:hAnsi="Calibri"/>
+                <w:color w:val="0F172A"/>
+                <w:sz w:val="17"/>
+              </w:rPr>
+              <w:t>Alto (Pérdida)</w:t>
+            </w:r>
+          </w:p>
+        </w:tc>
+        <w:tc>
+          <w:tcPr>
+            <w:tcW w:type="dxa" w:w="2016"/>
+            <w:shd w:fill="F8FAFC"/>
+            <w:tcMar>
+              <w:top w:w="70" w:type="dxa"/>
+              <w:bottom w:w="70" w:type="dxa"/>
+              <w:left w:w="90" w:type="dxa"/>
+              <w:right w:w="90" w:type="dxa"/>
+            </w:tcMar>
+          </w:tcPr>
+          <w:p>
+            <w:r>
+              <w:rPr>
+                <w:rFonts w:ascii="Calibri" w:hAnsi="Calibri"/>
+                <w:color w:val="0F172A"/>
+                <w:sz w:val="17"/>
+              </w:rPr>
+              <w:t>Respaldo automático en Google Shared Drive con SA.</w:t>
+            </w:r>
+          </w:p>
+        </w:tc>
+      </w:tr>
+    </w:tbl>
+    <w:p>
+      <w:pPr>
+        <w:spacing w:after="160"/>
+      </w:pPr>
+    </w:p>
+    <w:p>
+      <w:pPr>
+        <w:spacing w:before="280" w:after="100"/>
+      </w:pPr>
+      <w:r>
+        <w:rPr>
+          <w:rFonts w:ascii="Calibri" w:hAnsi="Calibri"/>
+          <w:b/>
+          <w:color w:val="1E3A8A"/>
+          <w:sz w:val="26"/>
+        </w:rPr>
+        <w:t>5. Matriz Comparativa Exhaustiva: Modelo Tradicional (AS-IS) vs Suite TEMIS (TO-BE)</w:t>
+      </w:r>
+    </w:p>
+    <w:tbl>
+      <w:tblPr>
+        <w:tblW w:type="auto" w:w="0"/>
+        <w:jc w:val="center"/>
+        <w:tblLayout w:type="fixed"/>
+        <w:tblLook w:firstColumn="1" w:firstRow="1" w:lastColumn="0" w:lastRow="0" w:noHBand="0" w:noVBand="1" w:val="04A0"/>
+      </w:tblPr>
+      <w:tblGrid>
+        <w:gridCol w:w="2160"/>
+        <w:gridCol w:w="2160"/>
+        <w:gridCol w:w="2160"/>
+        <w:gridCol w:w="2160"/>
+      </w:tblGrid>
+      <w:tr>
+        <w:tc>
+          <w:tcPr>
+            <w:tcW w:type="dxa" w:w="2160"/>
+            <w:shd w:fill="1E3A8A"/>
+            <w:tcMar>
+              <w:top w:w="90" w:type="dxa"/>
+              <w:bottom w:w="90" w:type="dxa"/>
+              <w:left w:w="100" w:type="dxa"/>
+              <w:right w:w="100" w:type="dxa"/>
+            </w:tcMar>
+          </w:tcPr>
+          <w:p>
+            <w:r>
+              <w:rPr>
+                <w:rFonts w:ascii="Calibri" w:hAnsi="Calibri"/>
+                <w:b/>
+                <w:color w:val="FFFFFF"/>
+                <w:sz w:val="18"/>
+              </w:rPr>
+              <w:t>Dimensión / Capacidad</w:t>
+            </w:r>
+          </w:p>
+        </w:tc>
+        <w:tc>
+          <w:tcPr>
+            <w:tcW w:type="dxa" w:w="2880"/>
+            <w:shd w:fill="1E3A8A"/>
+            <w:tcMar>
+              <w:top w:w="90" w:type="dxa"/>
+              <w:bottom w:w="90" w:type="dxa"/>
+              <w:left w:w="100" w:type="dxa"/>
+              <w:right w:w="100" w:type="dxa"/>
+            </w:tcMar>
+          </w:tcPr>
+          <w:p>
+            <w:r>
+              <w:rPr>
+                <w:rFonts w:ascii="Calibri" w:hAnsi="Calibri"/>
+                <w:b/>
+                <w:color w:val="FFFFFF"/>
+                <w:sz w:val="18"/>
+              </w:rPr>
+              <w:t>Modelo Tradicional (AS-IS)</w:t>
+            </w:r>
+          </w:p>
+        </w:tc>
+        <w:tc>
+          <w:tcPr>
+            <w:tcW w:type="dxa" w:w="3312"/>
+            <w:shd w:fill="1E3A8A"/>
+            <w:tcMar>
+              <w:top w:w="90" w:type="dxa"/>
+              <w:bottom w:w="90" w:type="dxa"/>
+              <w:left w:w="100" w:type="dxa"/>
+              <w:right w:w="100" w:type="dxa"/>
+            </w:tcMar>
+          </w:tcPr>
+          <w:p>
+            <w:r>
+              <w:rPr>
+                <w:rFonts w:ascii="Calibri" w:hAnsi="Calibri"/>
+                <w:b/>
+                <w:color w:val="FFFFFF"/>
+                <w:sz w:val="18"/>
+              </w:rPr>
+              <w:t>Suite TEMIS (TO-BE)</w:t>
+            </w:r>
+          </w:p>
+        </w:tc>
+        <w:tc>
+          <w:tcPr>
+            <w:tcW w:type="dxa" w:w="2448"/>
+            <w:shd w:fill="1E3A8A"/>
+            <w:tcMar>
+              <w:top w:w="90" w:type="dxa"/>
+              <w:bottom w:w="90" w:type="dxa"/>
+              <w:left w:w="100" w:type="dxa"/>
+              <w:right w:w="100" w:type="dxa"/>
+            </w:tcMar>
+          </w:tcPr>
+          <w:p>
+            <w:r>
+              <w:rPr>
+                <w:rFonts w:ascii="Calibri" w:hAnsi="Calibri"/>
+                <w:b/>
+                <w:color w:val="FFFFFF"/>
+                <w:sz w:val="18"/>
+              </w:rPr>
+              <w:t>Impacto / Beneficio</w:t>
+            </w:r>
+          </w:p>
+        </w:tc>
+      </w:tr>
+      <w:tr>
+        <w:tc>
+          <w:tcPr>
+            <w:tcW w:type="dxa" w:w="2160"/>
+            <w:shd w:fill="FFFFFF"/>
+            <w:tcMar>
+              <w:top w:w="70" w:type="dxa"/>
+              <w:bottom w:w="70" w:type="dxa"/>
+              <w:left w:w="90" w:type="dxa"/>
+              <w:right w:w="90" w:type="dxa"/>
+            </w:tcMar>
+          </w:tcPr>
+          <w:p>
+            <w:r>
+              <w:rPr>
+                <w:rFonts w:ascii="Calibri" w:hAnsi="Calibri"/>
+                <w:b/>
+                <w:color w:val="1E3A8A"/>
+                <w:sz w:val="17"/>
+              </w:rPr>
+              <w:t>Costo Financiero de Software</w:t>
+            </w:r>
+          </w:p>
+        </w:tc>
+        <w:tc>
+          <w:tcPr>
+            <w:tcW w:type="dxa" w:w="2880"/>
+            <w:shd w:fill="FFFFFF"/>
+            <w:tcMar>
+              <w:top w:w="70" w:type="dxa"/>
+              <w:bottom w:w="70" w:type="dxa"/>
+              <w:left w:w="90" w:type="dxa"/>
+              <w:right w:w="90" w:type="dxa"/>
+            </w:tcMar>
+          </w:tcPr>
+          <w:p>
+            <w:r>
+              <w:rPr>
+                <w:rFonts w:ascii="Calibri" w:hAnsi="Calibri"/>
+                <w:color w:val="0F172A"/>
+                <w:sz w:val="17"/>
+              </w:rPr>
+              <w:t>Pago recurrente anual en USD por licencias de Lucidchart.</w:t>
+            </w:r>
+          </w:p>
+        </w:tc>
+        <w:tc>
+          <w:tcPr>
+            <w:tcW w:type="dxa" w:w="3312"/>
+            <w:shd w:fill="FFFFFF"/>
+            <w:tcMar>
+              <w:top w:w="70" w:type="dxa"/>
+              <w:bottom w:w="70" w:type="dxa"/>
+              <w:left w:w="90" w:type="dxa"/>
+              <w:right w:w="90" w:type="dxa"/>
+            </w:tcMar>
+          </w:tcPr>
+          <w:p>
+            <w:r>
+              <w:rPr>
+                <w:rFonts w:ascii="Calibri" w:hAnsi="Calibri"/>
+                <w:color w:val="0F172A"/>
+                <w:sz w:val="17"/>
+              </w:rPr>
+              <w:t>Cero costo de licenciamiento. Software propietario soberano.</w:t>
+            </w:r>
+          </w:p>
+        </w:tc>
+        <w:tc>
+          <w:tcPr>
+            <w:tcW w:type="dxa" w:w="2448"/>
+            <w:shd w:fill="FFFFFF"/>
+            <w:tcMar>
+              <w:top w:w="70" w:type="dxa"/>
+              <w:bottom w:w="70" w:type="dxa"/>
+              <w:left w:w="90" w:type="dxa"/>
+              <w:right w:w="90" w:type="dxa"/>
+            </w:tcMar>
+          </w:tcPr>
+          <w:p>
+            <w:r>
+              <w:rPr>
+                <w:rFonts w:ascii="Calibri" w:hAnsi="Calibri"/>
+                <w:color w:val="0F172A"/>
+                <w:sz w:val="17"/>
+              </w:rPr>
+              <w:t>Ahorro del 100% en gasto recurrente SaaS.</w:t>
             </w:r>
           </w:p>
         </w:tc>
@@ -155,10 +1869,10 @@
             <w:tcW w:type="dxa" w:w="2160"/>
             <w:shd w:fill="F8FAFC"/>
             <w:tcMar>
-              <w:top w:w="80" w:type="dxa"/>
-              <w:bottom w:w="80" w:type="dxa"/>
-              <w:left w:w="100" w:type="dxa"/>
-              <w:right w:w="100" w:type="dxa"/>
+              <w:top w:w="70" w:type="dxa"/>
+              <w:bottom w:w="70" w:type="dxa"/>
+              <w:left w:w="90" w:type="dxa"/>
+              <w:right w:w="90" w:type="dxa"/>
             </w:tcMar>
           </w:tcPr>
           <w:p>
@@ -167,21 +1881,21 @@
                 <w:rFonts w:ascii="Calibri" w:hAnsi="Calibri"/>
                 <w:b/>
                 <w:color w:val="1E3A8A"/>
-                <w:sz w:val="18"/>
+                <w:sz w:val="17"/>
               </w:rPr>
-              <w:t>Versión:</w:t>
+              <w:t>Tiempo de Documentación</w:t>
             </w:r>
           </w:p>
         </w:tc>
         <w:tc>
           <w:tcPr>
-            <w:tcW w:type="dxa" w:w="2160"/>
-            <w:shd w:fill="FFFFFF"/>
+            <w:tcW w:type="dxa" w:w="2880"/>
+            <w:shd w:fill="F8FAFC"/>
             <w:tcMar>
-              <w:top w:w="80" w:type="dxa"/>
-              <w:bottom w:w="80" w:type="dxa"/>
-              <w:left w:w="100" w:type="dxa"/>
-              <w:right w:w="100" w:type="dxa"/>
+              <w:top w:w="70" w:type="dxa"/>
+              <w:bottom w:w="70" w:type="dxa"/>
+              <w:left w:w="90" w:type="dxa"/>
+              <w:right w:w="90" w:type="dxa"/>
             </w:tcMar>
           </w:tcPr>
           <w:p>
@@ -189,21 +1903,67 @@
               <w:rPr>
                 <w:rFonts w:ascii="Calibri" w:hAnsi="Calibri"/>
                 <w:color w:val="0F172A"/>
-                <w:sz w:val="18"/>
+                <w:sz w:val="17"/>
               </w:rPr>
-              <w:t>1.0 Oficial (Web Cloud SaaS)</w:t>
+              <w:t>20 a 40 horas por proceso entre diagramar y redactar en Word.</w:t>
             </w:r>
           </w:p>
         </w:tc>
         <w:tc>
           <w:tcPr>
-            <w:tcW w:type="dxa" w:w="2160"/>
+            <w:tcW w:type="dxa" w:w="3312"/>
             <w:shd w:fill="F8FAFC"/>
             <w:tcMar>
-              <w:top w:w="80" w:type="dxa"/>
-              <w:bottom w:w="80" w:type="dxa"/>
-              <w:left w:w="100" w:type="dxa"/>
-              <w:right w:w="100" w:type="dxa"/>
+              <w:top w:w="70" w:type="dxa"/>
+              <w:bottom w:w="70" w:type="dxa"/>
+              <w:left w:w="90" w:type="dxa"/>
+              <w:right w:w="90" w:type="dxa"/>
+            </w:tcMar>
+          </w:tcPr>
+          <w:p>
+            <w:r>
+              <w:rPr>
+                <w:rFonts w:ascii="Calibri" w:hAnsi="Calibri"/>
+                <w:color w:val="0F172A"/>
+                <w:sz w:val="17"/>
+              </w:rPr>
+              <w:t>Menos de 2 horas por proceso (Reducción del 80-90%).</w:t>
+            </w:r>
+          </w:p>
+        </w:tc>
+        <w:tc>
+          <w:tcPr>
+            <w:tcW w:type="dxa" w:w="2448"/>
+            <w:shd w:fill="F8FAFC"/>
+            <w:tcMar>
+              <w:top w:w="70" w:type="dxa"/>
+              <w:bottom w:w="70" w:type="dxa"/>
+              <w:left w:w="90" w:type="dxa"/>
+              <w:right w:w="90" w:type="dxa"/>
+            </w:tcMar>
+          </w:tcPr>
+          <w:p>
+            <w:r>
+              <w:rPr>
+                <w:rFonts w:ascii="Calibri" w:hAnsi="Calibri"/>
+                <w:color w:val="0F172A"/>
+                <w:sz w:val="17"/>
+              </w:rPr>
+              <w:t>Multiplica x5 la capacidad del equipo.</w:t>
+            </w:r>
+          </w:p>
+        </w:tc>
+      </w:tr>
+      <w:tr>
+        <w:tc>
+          <w:tcPr>
+            <w:tcW w:type="dxa" w:w="2160"/>
+            <w:shd w:fill="FFFFFF"/>
+            <w:tcMar>
+              <w:top w:w="70" w:type="dxa"/>
+              <w:bottom w:w="70" w:type="dxa"/>
+              <w:left w:w="90" w:type="dxa"/>
+              <w:right w:w="90" w:type="dxa"/>
             </w:tcMar>
           </w:tcPr>
           <w:p>
@@ -212,21 +1972,21 @@
                 <w:rFonts w:ascii="Calibri" w:hAnsi="Calibri"/>
                 <w:b/>
                 <w:color w:val="1E3A8A"/>
-                <w:sz w:val="18"/>
+                <w:sz w:val="17"/>
               </w:rPr>
-              <w:t>Estado:</w:t>
+              <w:t>Método de Entrada</w:t>
             </w:r>
           </w:p>
         </w:tc>
         <w:tc>
           <w:tcPr>
-            <w:tcW w:type="dxa" w:w="2160"/>
+            <w:tcW w:type="dxa" w:w="2880"/>
             <w:shd w:fill="FFFFFF"/>
             <w:tcMar>
-              <w:top w:w="80" w:type="dxa"/>
-              <w:bottom w:w="80" w:type="dxa"/>
-              <w:left w:w="100" w:type="dxa"/>
-              <w:right w:w="100" w:type="dxa"/>
+              <w:top w:w="70" w:type="dxa"/>
+              <w:bottom w:w="70" w:type="dxa"/>
+              <w:left w:w="90" w:type="dxa"/>
+              <w:right w:w="90" w:type="dxa"/>
             </w:tcMar>
           </w:tcPr>
           <w:p>
@@ -234,262 +1994,53 @@
               <w:rPr>
                 <w:rFonts w:ascii="Calibri" w:hAnsi="Calibri"/>
                 <w:color w:val="0F172A"/>
-                <w:sz w:val="18"/>
+                <w:sz w:val="17"/>
               </w:rPr>
-              <w:t>Aprobado / Línea Base</w:t>
+              <w:t>Lienzo gráfico en blanco con dibujo manual caja por caja.</w:t>
             </w:r>
           </w:p>
         </w:tc>
-      </w:tr>
-    </w:tbl>
-    <w:p>
-      <w:pPr>
-        <w:spacing w:after="240"/>
-      </w:pPr>
-    </w:p>
-    <w:p>
-      <w:pPr>
-        <w:spacing w:before="280" w:after="120"/>
-      </w:pPr>
-      <w:r>
-        <w:rPr>
-          <w:rFonts w:ascii="Calibri" w:hAnsi="Calibri"/>
-          <w:b/>
-          <w:color w:val="1E3A8A"/>
-          <w:sz w:val="28"/>
-        </w:rPr>
-        <w:t>1. Introducción y Resumen Ejecutivo</w:t>
-      </w:r>
-    </w:p>
-    <w:p>
-      <w:pPr>
-        <w:spacing w:after="100" w:line="276" w:lineRule="auto"/>
-      </w:pPr>
-      <w:r>
-        <w:rPr>
-          <w:rFonts w:ascii="Calibri" w:hAnsi="Calibri"/>
-          <w:color w:val="0F172A"/>
-          <w:sz w:val="20"/>
-        </w:rPr>
-        <w:t>La documentación y gobierno de procesos operativos ha dependido históricamente de herramientas desconectadas y procesos manuales que generan silos de información, desactualización de diagramas y horas de retrabajo en la redacción de manuales. El presente informe diagnostica las deficiencias del modelo actual (AS-IS) y fundamenta la arquitectura de solución de la Suite TEMIS (TO-BE).</w:t>
-      </w:r>
-    </w:p>
-    <w:p>
-      <w:pPr>
-        <w:spacing w:before="280" w:after="120"/>
-      </w:pPr>
-      <w:r>
-        <w:rPr>
-          <w:rFonts w:ascii="Calibri" w:hAnsi="Calibri"/>
-          <w:b/>
-          <w:color w:val="1E3A8A"/>
-          <w:sz w:val="28"/>
-        </w:rPr>
-        <w:t>2. Diagnóstico del Estado Actual (AS-IS): Puntos de Dolor</w:t>
-      </w:r>
-    </w:p>
-    <w:p>
-      <w:pPr>
-        <w:spacing w:after="100" w:line="276" w:lineRule="auto"/>
-      </w:pPr>
-      <w:r>
-        <w:rPr>
-          <w:rFonts w:ascii="Calibri" w:hAnsi="Calibri"/>
-          <w:b/>
-          <w:color w:val="0F172A"/>
-          <w:sz w:val="20"/>
-        </w:rPr>
-        <w:t xml:space="preserve">• Desconexión entre Diagramas y Manuales Escritos: </w:t>
-      </w:r>
-      <w:r>
-        <w:rPr>
-          <w:rFonts w:ascii="Calibri" w:hAnsi="Calibri"/>
-          <w:color w:val="0F172A"/>
-          <w:sz w:val="20"/>
-        </w:rPr>
-        <w:t>Un analista dibuja un flujo en Lucidchart o Visio y posteriormente tiene que redactar manualmente un documento de 20 páginas en Word, provocando inconsistencias severas entre lo dibujado y lo escrito.</w:t>
-      </w:r>
-    </w:p>
-    <w:p>
-      <w:pPr>
-        <w:spacing w:after="100" w:line="276" w:lineRule="auto"/>
-      </w:pPr>
-      <w:r>
-        <w:rPr>
-          <w:rFonts w:ascii="Calibri" w:hAnsi="Calibri"/>
-          <w:b/>
-          <w:color w:val="0F172A"/>
-          <w:sz w:val="20"/>
-        </w:rPr>
-        <w:t xml:space="preserve">• Falta de Estandarización en Simbología y Carriles: </w:t>
-      </w:r>
-      <w:r>
-        <w:rPr>
-          <w:rFonts w:ascii="Calibri" w:hAnsi="Calibri"/>
-          <w:color w:val="0F172A"/>
-          <w:sz w:val="20"/>
-        </w:rPr>
-        <w:t>Uso heterogéneo de símbolos, falta de identificación clara de sistemas tecnológicos (ej. Chronos) y canales de comunicación (ej. WhatsApp).</w:t>
-      </w:r>
-    </w:p>
-    <w:p>
-      <w:pPr>
-        <w:spacing w:after="100" w:line="276" w:lineRule="auto"/>
-      </w:pPr>
-      <w:r>
-        <w:rPr>
-          <w:rFonts w:ascii="Calibri" w:hAnsi="Calibri"/>
-          <w:b/>
-          <w:color w:val="0F172A"/>
-          <w:sz w:val="20"/>
-        </w:rPr>
-        <w:t xml:space="preserve">• Captura Lenta y Compleja para Usuarios No Técnicos: </w:t>
-      </w:r>
-      <w:r>
-        <w:rPr>
-          <w:rFonts w:ascii="Calibri" w:hAnsi="Calibri"/>
-          <w:color w:val="0F172A"/>
-          <w:sz w:val="20"/>
-        </w:rPr>
-        <w:t>Diseñar un flujo directamente en un lienzo en blanco resulta intimidante y lento para analistas de negocio que no dominan herramientas CAD.</w:t>
-      </w:r>
-    </w:p>
-    <w:p>
-      <w:pPr>
-        <w:spacing w:after="100" w:line="276" w:lineRule="auto"/>
-      </w:pPr>
-      <w:r>
-        <w:rPr>
-          <w:rFonts w:ascii="Calibri" w:hAnsi="Calibri"/>
-          <w:b/>
-          <w:color w:val="0F172A"/>
-          <w:sz w:val="20"/>
-        </w:rPr>
-        <w:t xml:space="preserve">• Ausencia de Auditoría de Calidad en Tiempo Real: </w:t>
-      </w:r>
-      <w:r>
-        <w:rPr>
-          <w:rFonts w:ascii="Calibri" w:hAnsi="Calibri"/>
-          <w:color w:val="0F172A"/>
-          <w:sz w:val="20"/>
-        </w:rPr>
-        <w:t>Los diagramas suelen contener compuertas de decisión sin salida alternativa o actividades huérfanas que no se detectan hasta una auditoría externa.</w:t>
-      </w:r>
-    </w:p>
-    <w:p>
-      <w:pPr>
-        <w:spacing w:after="100" w:line="276" w:lineRule="auto"/>
-      </w:pPr>
-      <w:r>
-        <w:rPr>
-          <w:rFonts w:ascii="Calibri" w:hAnsi="Calibri"/>
-          <w:b/>
-          <w:color w:val="0F172A"/>
-          <w:sz w:val="20"/>
-        </w:rPr>
-        <w:t xml:space="preserve">• Limitación de Clientes de Escritorio Monousuario: </w:t>
-      </w:r>
-      <w:r>
-        <w:rPr>
-          <w:rFonts w:ascii="Calibri" w:hAnsi="Calibri"/>
-          <w:color w:val="0F172A"/>
-          <w:sz w:val="20"/>
-        </w:rPr>
-        <w:t>Las soluciones instaladas en Windows impiden la colaboración ágil, demandan instalaciones locales y dificultan la gestión centralizada de versiones.</w:t>
-      </w:r>
-    </w:p>
-    <w:p>
-      <w:pPr>
-        <w:spacing w:before="280" w:after="120"/>
-      </w:pPr>
-      <w:r>
-        <w:rPr>
-          <w:rFonts w:ascii="Calibri" w:hAnsi="Calibri"/>
-          <w:b/>
-          <w:color w:val="1E3A8A"/>
-          <w:sz w:val="28"/>
-        </w:rPr>
-        <w:t>3. Análisis Comparativo: Modelo Actual (AS-IS) vs Modelo TEMIS (TO-BE)</w:t>
-      </w:r>
-    </w:p>
-    <w:tbl>
-      <w:tblPr>
-        <w:tblW w:type="auto" w:w="0"/>
-        <w:jc w:val="center"/>
-        <w:tblLook w:firstColumn="1" w:firstRow="1" w:lastColumn="0" w:lastRow="0" w:noHBand="0" w:noVBand="1" w:val="04A0"/>
-      </w:tblPr>
-      <w:tblGrid>
-        <w:gridCol w:w="2880"/>
-        <w:gridCol w:w="2880"/>
-        <w:gridCol w:w="2880"/>
-      </w:tblGrid>
-      <w:tr>
         <w:tc>
           <w:tcPr>
-            <w:tcW w:type="dxa" w:w="2880"/>
-            <w:shd w:fill="1E3A8A"/>
+            <w:tcW w:type="dxa" w:w="3312"/>
+            <w:shd w:fill="FFFFFF"/>
             <w:tcMar>
-              <w:top w:w="100" w:type="dxa"/>
-              <w:bottom w:w="100" w:type="dxa"/>
-              <w:left w:w="100" w:type="dxa"/>
-              <w:right w:w="100" w:type="dxa"/>
+              <w:top w:w="70" w:type="dxa"/>
+              <w:bottom w:w="70" w:type="dxa"/>
+              <w:left w:w="90" w:type="dxa"/>
+              <w:right w:w="90" w:type="dxa"/>
             </w:tcMar>
           </w:tcPr>
           <w:p>
             <w:r>
               <w:rPr>
                 <w:rFonts w:ascii="Calibri" w:hAnsi="Calibri"/>
-                <w:b/>
-                <w:color w:val="FFFFFF"/>
-                <w:sz w:val="19"/>
+                <w:color w:val="0F172A"/>
+                <w:sz w:val="17"/>
               </w:rPr>
-              <w:t>Dimensión / Capacidad</w:t>
+              <w:t>Matriz SIPOC Six Sigma con autocompletado inteligente Gemini IA.</w:t>
             </w:r>
           </w:p>
         </w:tc>
         <w:tc>
           <w:tcPr>
-            <w:tcW w:type="dxa" w:w="2880"/>
-            <w:shd w:fill="1E3A8A"/>
+            <w:tcW w:type="dxa" w:w="2448"/>
+            <w:shd w:fill="FFFFFF"/>
             <w:tcMar>
-              <w:top w:w="100" w:type="dxa"/>
-              <w:bottom w:w="100" w:type="dxa"/>
-              <w:left w:w="100" w:type="dxa"/>
-              <w:right w:w="100" w:type="dxa"/>
+              <w:top w:w="70" w:type="dxa"/>
+              <w:bottom w:w="70" w:type="dxa"/>
+              <w:left w:w="90" w:type="dxa"/>
+              <w:right w:w="90" w:type="dxa"/>
             </w:tcMar>
           </w:tcPr>
           <w:p>
             <w:r>
               <w:rPr>
                 <w:rFonts w:ascii="Calibri" w:hAnsi="Calibri"/>
-                <w:b/>
-                <w:color w:val="FFFFFF"/>
-                <w:sz w:val="19"/>
+                <w:color w:val="0F172A"/>
+                <w:sz w:val="17"/>
               </w:rPr>
-              <w:t>Modelo Tradicional (AS-IS)</w:t>
-            </w:r>
-          </w:p>
-        </w:tc>
-        <w:tc>
-          <w:tcPr>
-            <w:tcW w:type="dxa" w:w="2880"/>
-            <w:shd w:fill="1E3A8A"/>
-            <w:tcMar>
-              <w:top w:w="100" w:type="dxa"/>
-              <w:bottom w:w="100" w:type="dxa"/>
-              <w:left w:w="100" w:type="dxa"/>
-              <w:right w:w="100" w:type="dxa"/>
-            </w:tcMar>
-          </w:tcPr>
-          <w:p>
-            <w:r>
-              <w:rPr>
-                <w:rFonts w:ascii="Calibri" w:hAnsi="Calibri"/>
-                <w:b/>
-                <w:color w:val="FFFFFF"/>
-                <w:sz w:val="19"/>
-              </w:rPr>
-              <w:t>Modelo Suite TEMIS (TO-BE)</w:t>
+              <w:t>Accesible para cualquier perfil de analista.</w:t>
             </w:r>
           </w:p>
         </w:tc>
@@ -497,13 +2048,13 @@
       <w:tr>
         <w:tc>
           <w:tcPr>
-            <w:tcW w:type="dxa" w:w="2880"/>
-            <w:shd w:fill="FFFFFF"/>
+            <w:tcW w:type="dxa" w:w="2160"/>
+            <w:shd w:fill="F8FAFC"/>
             <w:tcMar>
-              <w:top w:w="80" w:type="dxa"/>
-              <w:bottom w:w="80" w:type="dxa"/>
-              <w:left w:w="100" w:type="dxa"/>
-              <w:right w:w="100" w:type="dxa"/>
+              <w:top w:w="70" w:type="dxa"/>
+              <w:bottom w:w="70" w:type="dxa"/>
+              <w:left w:w="90" w:type="dxa"/>
+              <w:right w:w="90" w:type="dxa"/>
             </w:tcMar>
           </w:tcPr>
           <w:p>
@@ -512,9 +2063,100 @@
                 <w:rFonts w:ascii="Calibri" w:hAnsi="Calibri"/>
                 <w:b/>
                 <w:color w:val="1E3A8A"/>
-                <w:sz w:val="18"/>
+                <w:sz w:val="17"/>
               </w:rPr>
-              <w:t>Entrada de Datos</w:t>
+              <w:t>Generación Gráfica</w:t>
+            </w:r>
+          </w:p>
+        </w:tc>
+        <w:tc>
+          <w:tcPr>
+            <w:tcW w:type="dxa" w:w="2880"/>
+            <w:shd w:fill="F8FAFC"/>
+            <w:tcMar>
+              <w:top w:w="70" w:type="dxa"/>
+              <w:bottom w:w="70" w:type="dxa"/>
+              <w:left w:w="90" w:type="dxa"/>
+              <w:right w:w="90" w:type="dxa"/>
+            </w:tcMar>
+          </w:tcPr>
+          <w:p>
+            <w:r>
+              <w:rPr>
+                <w:rFonts w:ascii="Calibri" w:hAnsi="Calibri"/>
+                <w:color w:val="0F172A"/>
+                <w:sz w:val="17"/>
+              </w:rPr>
+              <w:t>Alineación manual propensa a líneas cruzadas y desorden.</w:t>
+            </w:r>
+          </w:p>
+        </w:tc>
+        <w:tc>
+          <w:tcPr>
+            <w:tcW w:type="dxa" w:w="3312"/>
+            <w:shd w:fill="F8FAFC"/>
+            <w:tcMar>
+              <w:top w:w="70" w:type="dxa"/>
+              <w:bottom w:w="70" w:type="dxa"/>
+              <w:left w:w="90" w:type="dxa"/>
+              <w:right w:w="90" w:type="dxa"/>
+            </w:tcMar>
+          </w:tcPr>
+          <w:p>
+            <w:r>
+              <w:rPr>
+                <w:rFonts w:ascii="Calibri" w:hAnsi="Calibri"/>
+                <w:color w:val="0F172A"/>
+                <w:sz w:val="17"/>
+              </w:rPr>
+              <w:t>Ruteo perimetral automático con curvas cúbicas SVG Bézier.</w:t>
+            </w:r>
+          </w:p>
+        </w:tc>
+        <w:tc>
+          <w:tcPr>
+            <w:tcW w:type="dxa" w:w="2448"/>
+            <w:shd w:fill="F8FAFC"/>
+            <w:tcMar>
+              <w:top w:w="70" w:type="dxa"/>
+              <w:bottom w:w="70" w:type="dxa"/>
+              <w:left w:w="90" w:type="dxa"/>
+              <w:right w:w="90" w:type="dxa"/>
+            </w:tcMar>
+          </w:tcPr>
+          <w:p>
+            <w:r>
+              <w:rPr>
+                <w:rFonts w:ascii="Calibri" w:hAnsi="Calibri"/>
+                <w:color w:val="0F172A"/>
+                <w:sz w:val="17"/>
+              </w:rPr>
+              <w:t>Estandarización y estética impecable.</w:t>
+            </w:r>
+          </w:p>
+        </w:tc>
+      </w:tr>
+      <w:tr>
+        <w:tc>
+          <w:tcPr>
+            <w:tcW w:type="dxa" w:w="2160"/>
+            <w:shd w:fill="FFFFFF"/>
+            <w:tcMar>
+              <w:top w:w="70" w:type="dxa"/>
+              <w:bottom w:w="70" w:type="dxa"/>
+              <w:left w:w="90" w:type="dxa"/>
+              <w:right w:w="90" w:type="dxa"/>
+            </w:tcMar>
+          </w:tcPr>
+          <w:p>
+            <w:r>
+              <w:rPr>
+                <w:rFonts w:ascii="Calibri" w:hAnsi="Calibri"/>
+                <w:b/>
+                <w:color w:val="1E3A8A"/>
+                <w:sz w:val="17"/>
+              </w:rPr>
+              <w:t>Redacción de Políticas</w:t>
             </w:r>
           </w:p>
         </w:tc>
@@ -523,19 +2165,180 @@
             <w:tcW w:type="dxa" w:w="2880"/>
             <w:shd w:fill="FFFFFF"/>
             <w:tcMar>
-              <w:top w:w="80" w:type="dxa"/>
-              <w:bottom w:w="80" w:type="dxa"/>
-              <w:left w:w="100" w:type="dxa"/>
-              <w:right w:w="100" w:type="dxa"/>
+              <w:top w:w="70" w:type="dxa"/>
+              <w:bottom w:w="70" w:type="dxa"/>
+              <w:left w:w="90" w:type="dxa"/>
+              <w:right w:w="90" w:type="dxa"/>
             </w:tcMar>
           </w:tcPr>
           <w:p>
             <w:r>
               <w:rPr>
                 <w:rFonts w:ascii="Calibri" w:hAnsi="Calibri"/>
-                <w:sz w:val="18"/>
+                <w:color w:val="0F172A"/>
+                <w:sz w:val="17"/>
               </w:rPr>
-              <w:t>Dibujo manual caja por caja en lienzo en blanco.</w:t>
+              <w:t>Transcripción manual en Word sujeta a contradicciones.</w:t>
+            </w:r>
+          </w:p>
+        </w:tc>
+        <w:tc>
+          <w:tcPr>
+            <w:tcW w:type="dxa" w:w="3312"/>
+            <w:shd w:fill="FFFFFF"/>
+            <w:tcMar>
+              <w:top w:w="70" w:type="dxa"/>
+              <w:bottom w:w="70" w:type="dxa"/>
+              <w:left w:w="90" w:type="dxa"/>
+              <w:right w:w="90" w:type="dxa"/>
+            </w:tcMar>
+          </w:tcPr>
+          <w:p>
+            <w:r>
+              <w:rPr>
+                <w:rFonts w:ascii="Calibri" w:hAnsi="Calibri"/>
+                <w:color w:val="0F172A"/>
+                <w:sz w:val="17"/>
+              </w:rPr>
+              <w:t>Generación automática en texto corrido estructurado (1.0..N).</w:t>
+            </w:r>
+          </w:p>
+        </w:tc>
+        <w:tc>
+          <w:tcPr>
+            <w:tcW w:type="dxa" w:w="2448"/>
+            <w:shd w:fill="FFFFFF"/>
+            <w:tcMar>
+              <w:top w:w="70" w:type="dxa"/>
+              <w:bottom w:w="70" w:type="dxa"/>
+              <w:left w:w="90" w:type="dxa"/>
+              <w:right w:w="90" w:type="dxa"/>
+            </w:tcMar>
+          </w:tcPr>
+          <w:p>
+            <w:r>
+              <w:rPr>
+                <w:rFonts w:ascii="Calibri" w:hAnsi="Calibri"/>
+                <w:color w:val="0F172A"/>
+                <w:sz w:val="17"/>
+              </w:rPr>
+              <w:t>Consistencia 100% entre diagrama y texto.</w:t>
+            </w:r>
+          </w:p>
+        </w:tc>
+      </w:tr>
+      <w:tr>
+        <w:tc>
+          <w:tcPr>
+            <w:tcW w:type="dxa" w:w="2160"/>
+            <w:shd w:fill="F8FAFC"/>
+            <w:tcMar>
+              <w:top w:w="70" w:type="dxa"/>
+              <w:bottom w:w="70" w:type="dxa"/>
+              <w:left w:w="90" w:type="dxa"/>
+              <w:right w:w="90" w:type="dxa"/>
+            </w:tcMar>
+          </w:tcPr>
+          <w:p>
+            <w:r>
+              <w:rPr>
+                <w:rFonts w:ascii="Calibri" w:hAnsi="Calibri"/>
+                <w:b/>
+                <w:color w:val="1E3A8A"/>
+                <w:sz w:val="17"/>
+              </w:rPr>
+              <w:t>Auditoría de Calidad</w:t>
+            </w:r>
+          </w:p>
+        </w:tc>
+        <w:tc>
+          <w:tcPr>
+            <w:tcW w:type="dxa" w:w="2880"/>
+            <w:shd w:fill="F8FAFC"/>
+            <w:tcMar>
+              <w:top w:w="70" w:type="dxa"/>
+              <w:bottom w:w="70" w:type="dxa"/>
+              <w:left w:w="90" w:type="dxa"/>
+              <w:right w:w="90" w:type="dxa"/>
+            </w:tcMar>
+          </w:tcPr>
+          <w:p>
+            <w:r>
+              <w:rPr>
+                <w:rFonts w:ascii="Calibri" w:hAnsi="Calibri"/>
+                <w:color w:val="0F172A"/>
+                <w:sz w:val="17"/>
+              </w:rPr>
+              <w:t>Revisión manual subjetiva y tardía tras publicación.</w:t>
+            </w:r>
+          </w:p>
+        </w:tc>
+        <w:tc>
+          <w:tcPr>
+            <w:tcW w:type="dxa" w:w="3312"/>
+            <w:shd w:fill="F8FAFC"/>
+            <w:tcMar>
+              <w:top w:w="70" w:type="dxa"/>
+              <w:bottom w:w="70" w:type="dxa"/>
+              <w:left w:w="90" w:type="dxa"/>
+              <w:right w:w="90" w:type="dxa"/>
+            </w:tcMar>
+          </w:tcPr>
+          <w:p>
+            <w:r>
+              <w:rPr>
+                <w:rFonts w:ascii="Calibri" w:hAnsi="Calibri"/>
+                <w:color w:val="0F172A"/>
+                <w:sz w:val="17"/>
+              </w:rPr>
+              <w:t>Auditor IA instantáneo con calificación 0-100 y recomendaciones.</w:t>
+            </w:r>
+          </w:p>
+        </w:tc>
+        <w:tc>
+          <w:tcPr>
+            <w:tcW w:type="dxa" w:w="2448"/>
+            <w:shd w:fill="F8FAFC"/>
+            <w:tcMar>
+              <w:top w:w="70" w:type="dxa"/>
+              <w:bottom w:w="70" w:type="dxa"/>
+              <w:left w:w="90" w:type="dxa"/>
+              <w:right w:w="90" w:type="dxa"/>
+            </w:tcMar>
+          </w:tcPr>
+          <w:p>
+            <w:r>
+              <w:rPr>
+                <w:rFonts w:ascii="Calibri" w:hAnsi="Calibri"/>
+                <w:color w:val="0F172A"/>
+                <w:sz w:val="17"/>
+              </w:rPr>
+              <w:t>Cero procesos inconclusos en producción.</w:t>
+            </w:r>
+          </w:p>
+        </w:tc>
+      </w:tr>
+      <w:tr>
+        <w:tc>
+          <w:tcPr>
+            <w:tcW w:type="dxa" w:w="2160"/>
+            <w:shd w:fill="FFFFFF"/>
+            <w:tcMar>
+              <w:top w:w="70" w:type="dxa"/>
+              <w:bottom w:w="70" w:type="dxa"/>
+              <w:left w:w="90" w:type="dxa"/>
+              <w:right w:w="90" w:type="dxa"/>
+            </w:tcMar>
+          </w:tcPr>
+          <w:p>
+            <w:r>
+              <w:rPr>
+                <w:rFonts w:ascii="Calibri" w:hAnsi="Calibri"/>
+                <w:b/>
+                <w:color w:val="1E3A8A"/>
+                <w:sz w:val="17"/>
+              </w:rPr>
+              <w:t>Integración Tecnológica</w:t>
             </w:r>
           </w:p>
         </w:tc>
@@ -544,21 +2347,64 @@
             <w:tcW w:type="dxa" w:w="2880"/>
             <w:shd w:fill="FFFFFF"/>
             <w:tcMar>
-              <w:top w:w="80" w:type="dxa"/>
-              <w:bottom w:w="80" w:type="dxa"/>
-              <w:left w:w="100" w:type="dxa"/>
-              <w:right w:w="100" w:type="dxa"/>
+              <w:top w:w="70" w:type="dxa"/>
+              <w:bottom w:w="70" w:type="dxa"/>
+              <w:left w:w="90" w:type="dxa"/>
+              <w:right w:w="90" w:type="dxa"/>
             </w:tcMar>
           </w:tcPr>
           <w:p>
             <w:r>
               <w:rPr>
                 <w:rFonts w:ascii="Calibri" w:hAnsi="Calibri"/>
-                <w:b/>
-                <w:color w:val="0F766E"/>
-                <w:sz w:val="18"/>
+                <w:color w:val="0F172A"/>
+                <w:sz w:val="17"/>
               </w:rPr>
-              <w:t>Matriz SIPOC Six Sigma tabular con autocompletado inteligente por Gemini 2.5 Flash.</w:t>
+              <w:t>Herramientas aisladas sin noción de sistemas de la empresa.</w:t>
+            </w:r>
+          </w:p>
+        </w:tc>
+        <w:tc>
+          <w:tcPr>
+            <w:tcW w:type="dxa" w:w="3312"/>
+            <w:shd w:fill="FFFFFF"/>
+            <w:tcMar>
+              <w:top w:w="70" w:type="dxa"/>
+              <w:bottom w:w="70" w:type="dxa"/>
+              <w:left w:w="90" w:type="dxa"/>
+              <w:right w:w="90" w:type="dxa"/>
+            </w:tcMar>
+          </w:tcPr>
+          <w:p>
+            <w:r>
+              <w:rPr>
+                <w:rFonts w:ascii="Calibri" w:hAnsi="Calibri"/>
+                <w:color w:val="0F172A"/>
+                <w:sz w:val="17"/>
+              </w:rPr>
+              <w:t>Etiquetas nativas para Chronos, Freshdesk, Bria, WhatsApp.</w:t>
+            </w:r>
+          </w:p>
+        </w:tc>
+        <w:tc>
+          <w:tcPr>
+            <w:tcW w:type="dxa" w:w="2448"/>
+            <w:shd w:fill="FFFFFF"/>
+            <w:tcMar>
+              <w:top w:w="70" w:type="dxa"/>
+              <w:bottom w:w="70" w:type="dxa"/>
+              <w:left w:w="90" w:type="dxa"/>
+              <w:right w:w="90" w:type="dxa"/>
+            </w:tcMar>
+          </w:tcPr>
+          <w:p>
+            <w:r>
+              <w:rPr>
+                <w:rFonts w:ascii="Calibri" w:hAnsi="Calibri"/>
+                <w:color w:val="0F172A"/>
+                <w:sz w:val="17"/>
+              </w:rPr>
+              <w:t>Claridad absoluta para TI y Operaciones.</w:t>
             </w:r>
           </w:p>
         </w:tc>
@@ -566,13 +2412,13 @@
       <w:tr>
         <w:tc>
           <w:tcPr>
-            <w:tcW w:type="dxa" w:w="2880"/>
-            <w:shd w:fill="F1F5F9"/>
+            <w:tcW w:type="dxa" w:w="2160"/>
+            <w:shd w:fill="F8FAFC"/>
             <w:tcMar>
-              <w:top w:w="80" w:type="dxa"/>
-              <w:bottom w:w="80" w:type="dxa"/>
-              <w:left w:w="100" w:type="dxa"/>
-              <w:right w:w="100" w:type="dxa"/>
+              <w:top w:w="70" w:type="dxa"/>
+              <w:bottom w:w="70" w:type="dxa"/>
+              <w:left w:w="90" w:type="dxa"/>
+              <w:right w:w="90" w:type="dxa"/>
             </w:tcMar>
           </w:tcPr>
           <w:p>
@@ -581,260 +2427,75 @@
                 <w:rFonts w:ascii="Calibri" w:hAnsi="Calibri"/>
                 <w:b/>
                 <w:color w:val="1E3A8A"/>
-                <w:sz w:val="18"/>
+                <w:sz w:val="17"/>
               </w:rPr>
-              <w:t>Generación de Diagrama</w:t>
+              <w:t>Almacenamiento &amp; Backup</w:t>
             </w:r>
           </w:p>
         </w:tc>
         <w:tc>
           <w:tcPr>
             <w:tcW w:type="dxa" w:w="2880"/>
-            <w:shd w:fill="F1F5F9"/>
+            <w:shd w:fill="F8FAFC"/>
             <w:tcMar>
-              <w:top w:w="80" w:type="dxa"/>
-              <w:bottom w:w="80" w:type="dxa"/>
-              <w:left w:w="100" w:type="dxa"/>
-              <w:right w:w="100" w:type="dxa"/>
+              <w:top w:w="70" w:type="dxa"/>
+              <w:bottom w:w="70" w:type="dxa"/>
+              <w:left w:w="90" w:type="dxa"/>
+              <w:right w:w="90" w:type="dxa"/>
             </w:tcMar>
           </w:tcPr>
           <w:p>
             <w:r>
               <w:rPr>
                 <w:rFonts w:ascii="Calibri" w:hAnsi="Calibri"/>
-                <w:sz w:val="18"/>
+                <w:color w:val="0F172A"/>
+                <w:sz w:val="17"/>
               </w:rPr>
-              <w:t>Horas de alineación manual de conectores y cajas.</w:t>
+              <w:t>Archivos dispersos en discos duros locales sin control.</w:t>
             </w:r>
           </w:p>
         </w:tc>
         <w:tc>
           <w:tcPr>
-            <w:tcW w:type="dxa" w:w="2880"/>
-            <w:shd w:fill="F1F5F9"/>
+            <w:tcW w:type="dxa" w:w="3312"/>
+            <w:shd w:fill="F8FAFC"/>
             <w:tcMar>
-              <w:top w:w="80" w:type="dxa"/>
-              <w:bottom w:w="80" w:type="dxa"/>
-              <w:left w:w="100" w:type="dxa"/>
-              <w:right w:w="100" w:type="dxa"/>
+              <w:top w:w="70" w:type="dxa"/>
+              <w:bottom w:w="70" w:type="dxa"/>
+              <w:left w:w="90" w:type="dxa"/>
+              <w:right w:w="90" w:type="dxa"/>
             </w:tcMar>
           </w:tcPr>
           <w:p>
             <w:r>
               <w:rPr>
                 <w:rFonts w:ascii="Calibri" w:hAnsi="Calibri"/>
-                <w:b/>
-                <w:color w:val="0F766E"/>
-                <w:sz w:val="18"/>
+                <w:color w:val="0F172A"/>
+                <w:sz w:val="17"/>
               </w:rPr>
-              <w:t>Generación automática en 1 clic con curvas Bézier perimetrales y etiquetas de sistemas/canales.</w:t>
+              <w:t>Catálogo en Menú Archivo y respaldo en Shared Drive con SA.</w:t>
             </w:r>
           </w:p>
         </w:tc>
-      </w:tr>
-      <w:tr>
         <w:tc>
           <w:tcPr>
-            <w:tcW w:type="dxa" w:w="2880"/>
-            <w:shd w:fill="FFFFFF"/>
+            <w:tcW w:type="dxa" w:w="2448"/>
+            <w:shd w:fill="F8FAFC"/>
             <w:tcMar>
-              <w:top w:w="80" w:type="dxa"/>
-              <w:bottom w:w="80" w:type="dxa"/>
-              <w:left w:w="100" w:type="dxa"/>
-              <w:right w:w="100" w:type="dxa"/>
+              <w:top w:w="70" w:type="dxa"/>
+              <w:bottom w:w="70" w:type="dxa"/>
+              <w:left w:w="90" w:type="dxa"/>
+              <w:right w:w="90" w:type="dxa"/>
             </w:tcMar>
           </w:tcPr>
           <w:p>
             <w:r>
               <w:rPr>
                 <w:rFonts w:ascii="Calibri" w:hAnsi="Calibri"/>
-                <w:b/>
-                <w:color w:val="1E3A8A"/>
-                <w:sz w:val="18"/>
+                <w:color w:val="0F172A"/>
+                <w:sz w:val="17"/>
               </w:rPr>
-              <w:t>Documentación / Manual</w:t>
-            </w:r>
-          </w:p>
-        </w:tc>
-        <w:tc>
-          <w:tcPr>
-            <w:tcW w:type="dxa" w:w="2880"/>
-            <w:shd w:fill="FFFFFF"/>
-            <w:tcMar>
-              <w:top w:w="80" w:type="dxa"/>
-              <w:bottom w:w="80" w:type="dxa"/>
-              <w:left w:w="100" w:type="dxa"/>
-              <w:right w:w="100" w:type="dxa"/>
-            </w:tcMar>
-          </w:tcPr>
-          <w:p>
-            <w:r>
-              <w:rPr>
-                <w:rFonts w:ascii="Calibri" w:hAnsi="Calibri"/>
-                <w:sz w:val="18"/>
-              </w:rPr>
-              <w:t>Redacción manual en Word propensa a errores.</w:t>
-            </w:r>
-          </w:p>
-        </w:tc>
-        <w:tc>
-          <w:tcPr>
-            <w:tcW w:type="dxa" w:w="2880"/>
-            <w:shd w:fill="FFFFFF"/>
-            <w:tcMar>
-              <w:top w:w="80" w:type="dxa"/>
-              <w:bottom w:w="80" w:type="dxa"/>
-              <w:left w:w="100" w:type="dxa"/>
-              <w:right w:w="100" w:type="dxa"/>
-            </w:tcMar>
-          </w:tcPr>
-          <w:p>
-            <w:r>
-              <w:rPr>
-                <w:rFonts w:ascii="Calibri" w:hAnsi="Calibri"/>
-                <w:b/>
-                <w:color w:val="0F766E"/>
-                <w:sz w:val="18"/>
-              </w:rPr>
-              <w:t>Redacción automática en prosa continua estructurada (1.0..N) con IA en segundos.</w:t>
-            </w:r>
-          </w:p>
-        </w:tc>
-      </w:tr>
-      <w:tr>
-        <w:tc>
-          <w:tcPr>
-            <w:tcW w:type="dxa" w:w="2880"/>
-            <w:shd w:fill="F1F5F9"/>
-            <w:tcMar>
-              <w:top w:w="80" w:type="dxa"/>
-              <w:bottom w:w="80" w:type="dxa"/>
-              <w:left w:w="100" w:type="dxa"/>
-              <w:right w:w="100" w:type="dxa"/>
-            </w:tcMar>
-          </w:tcPr>
-          <w:p>
-            <w:r>
-              <w:rPr>
-                <w:rFonts w:ascii="Calibri" w:hAnsi="Calibri"/>
-                <w:b/>
-                <w:color w:val="1E3A8A"/>
-                <w:sz w:val="18"/>
-              </w:rPr>
-              <w:t>Auditoría y Calidad</w:t>
-            </w:r>
-          </w:p>
-        </w:tc>
-        <w:tc>
-          <w:tcPr>
-            <w:tcW w:type="dxa" w:w="2880"/>
-            <w:shd w:fill="F1F5F9"/>
-            <w:tcMar>
-              <w:top w:w="80" w:type="dxa"/>
-              <w:bottom w:w="80" w:type="dxa"/>
-              <w:left w:w="100" w:type="dxa"/>
-              <w:right w:w="100" w:type="dxa"/>
-            </w:tcMar>
-          </w:tcPr>
-          <w:p>
-            <w:r>
-              <w:rPr>
-                <w:rFonts w:ascii="Calibri" w:hAnsi="Calibri"/>
-                <w:sz w:val="18"/>
-              </w:rPr>
-              <w:t>Revisión manual subjetiva y tardía.</w:t>
-            </w:r>
-          </w:p>
-        </w:tc>
-        <w:tc>
-          <w:tcPr>
-            <w:tcW w:type="dxa" w:w="2880"/>
-            <w:shd w:fill="F1F5F9"/>
-            <w:tcMar>
-              <w:top w:w="80" w:type="dxa"/>
-              <w:bottom w:w="80" w:type="dxa"/>
-              <w:left w:w="100" w:type="dxa"/>
-              <w:right w:w="100" w:type="dxa"/>
-            </w:tcMar>
-          </w:tcPr>
-          <w:p>
-            <w:r>
-              <w:rPr>
-                <w:rFonts w:ascii="Calibri" w:hAnsi="Calibri"/>
-                <w:b/>
-                <w:color w:val="0F766E"/>
-                <w:sz w:val="18"/>
-              </w:rPr>
-              <w:t>Auditor IA en tiempo real con puntuación Six Sigma 0-100 y recomendaciones automáticas.</w:t>
-            </w:r>
-          </w:p>
-        </w:tc>
-      </w:tr>
-      <w:tr>
-        <w:tc>
-          <w:tcPr>
-            <w:tcW w:type="dxa" w:w="2880"/>
-            <w:shd w:fill="FFFFFF"/>
-            <w:tcMar>
-              <w:top w:w="80" w:type="dxa"/>
-              <w:bottom w:w="80" w:type="dxa"/>
-              <w:left w:w="100" w:type="dxa"/>
-              <w:right w:w="100" w:type="dxa"/>
-            </w:tcMar>
-          </w:tcPr>
-          <w:p>
-            <w:r>
-              <w:rPr>
-                <w:rFonts w:ascii="Calibri" w:hAnsi="Calibri"/>
-                <w:b/>
-                <w:color w:val="1E3A8A"/>
-                <w:sz w:val="18"/>
-              </w:rPr>
-              <w:t>Almacenamiento y Versiones</w:t>
-            </w:r>
-          </w:p>
-        </w:tc>
-        <w:tc>
-          <w:tcPr>
-            <w:tcW w:type="dxa" w:w="2880"/>
-            <w:shd w:fill="FFFFFF"/>
-            <w:tcMar>
-              <w:top w:w="80" w:type="dxa"/>
-              <w:bottom w:w="80" w:type="dxa"/>
-              <w:left w:w="100" w:type="dxa"/>
-              <w:right w:w="100" w:type="dxa"/>
-            </w:tcMar>
-          </w:tcPr>
-          <w:p>
-            <w:r>
-              <w:rPr>
-                <w:rFonts w:ascii="Calibri" w:hAnsi="Calibri"/>
-                <w:sz w:val="18"/>
-              </w:rPr>
-              <w:t>Archivos dispersos en carpetas locales.</w:t>
-            </w:r>
-          </w:p>
-        </w:tc>
-        <w:tc>
-          <w:tcPr>
-            <w:tcW w:type="dxa" w:w="2880"/>
-            <w:shd w:fill="FFFFFF"/>
-            <w:tcMar>
-              <w:top w:w="80" w:type="dxa"/>
-              <w:bottom w:w="80" w:type="dxa"/>
-              <w:left w:w="100" w:type="dxa"/>
-              <w:right w:w="100" w:type="dxa"/>
-            </w:tcMar>
-          </w:tcPr>
-          <w:p>
-            <w:r>
-              <w:rPr>
-                <w:rFonts w:ascii="Calibri" w:hAnsi="Calibri"/>
-                <w:b/>
-                <w:color w:val="0F766E"/>
-                <w:sz w:val="18"/>
-              </w:rPr>
-              <w:t>Catálogo centralizado en Menú Archivo y respaldo automático en Google Workspace Shared Drive con SA.</w:t>
+              <w:t>Seguridad, control de versiones y gobierno.</w:t>
             </w:r>
           </w:p>
         </w:tc>
@@ -842,29 +2503,99 @@
     </w:tbl>
     <w:p>
       <w:pPr>
-        <w:spacing w:before="280" w:after="120"/>
+        <w:spacing w:after="160"/>
+      </w:pPr>
+    </w:p>
+    <w:p>
+      <w:pPr>
+        <w:spacing w:before="280" w:after="100"/>
       </w:pPr>
       <w:r>
         <w:rPr>
           <w:rFonts w:ascii="Calibri" w:hAnsi="Calibri"/>
           <w:b/>
           <w:color w:val="1E3A8A"/>
-          <w:sz w:val="28"/>
+          <w:sz w:val="26"/>
         </w:rPr>
-        <w:t>4. Conclusiones y Plan de Transición</w:t>
+        <w:t>6. Conclusiones y Plan de Habilitación Tecnológica</w:t>
       </w:r>
     </w:p>
     <w:p>
       <w:pPr>
-        <w:spacing w:after="100" w:line="276" w:lineRule="auto"/>
+        <w:spacing w:after="80" w:line="276" w:lineRule="auto"/>
       </w:pPr>
       <w:r>
         <w:rPr>
           <w:rFonts w:ascii="Calibri" w:hAnsi="Calibri"/>
           <w:color w:val="0F172A"/>
-          <w:sz w:val="20"/>
+          <w:sz w:val="19"/>
         </w:rPr>
-        <w:t>La implementación de TEMIS elimina el 80% del tiempo operativo dedicado a la diagramación y redacción de procedimientos, garantizando consistencia absoluta entre la captura tabular (SIPOC), la representación gráfica (BPMN) y el manual de políticas oficial. La plataforma se posiciona como el estándar corporativo definitivo para la gobernanza de procesos de la organización.</w:t>
+        <w:t>El diagnóstico evidencia que la dependencia de Lucidchart y la redacción manual en Word generaban un cuello de botella severo y un costo injustificado. La Suite TEMIS resuelve integralmente esta problemática al unificar la captura Six Sigma, el modelado visual inteligente y la redacción automatizada con IA en una plataforma soberana en la nube.</w:t>
+      </w:r>
+    </w:p>
+    <w:p>
+      <w:pPr>
+        <w:spacing w:after="80" w:line="276" w:lineRule="auto"/>
+      </w:pPr>
+      <w:r>
+        <w:rPr>
+          <w:rFonts w:ascii="Calibri" w:hAnsi="Calibri"/>
+          <w:color w:val="0F172A"/>
+          <w:sz w:val="19"/>
+        </w:rPr>
+        <w:t>El plan de habilitación comprende:</w:t>
+      </w:r>
+    </w:p>
+    <w:p>
+      <w:pPr>
+        <w:spacing w:after="80" w:line="276" w:lineRule="auto"/>
+      </w:pPr>
+      <w:r>
+        <w:rPr>
+          <w:rFonts w:ascii="Calibri" w:hAnsi="Calibri"/>
+          <w:color w:val="0F172A"/>
+          <w:sz w:val="19"/>
+        </w:rPr>
+        <w:t>• Despliegue de TEMIS Web Flow en Render Cloud con base de datos PostgreSQL administrada.</w:t>
+      </w:r>
+    </w:p>
+    <w:p>
+      <w:pPr>
+        <w:spacing w:after="80" w:line="276" w:lineRule="auto"/>
+      </w:pPr>
+      <w:r>
+        <w:rPr>
+          <w:rFonts w:ascii="Calibri" w:hAnsi="Calibri"/>
+          <w:color w:val="0F172A"/>
+          <w:sz w:val="19"/>
+        </w:rPr>
+        <w:t>• Migración masiva de diagramas existentes de Lucidchart mediante el Parser Nativo 1-a-1.</w:t>
+      </w:r>
+    </w:p>
+    <w:p>
+      <w:pPr>
+        <w:spacing w:after="80" w:line="276" w:lineRule="auto"/>
+      </w:pPr>
+      <w:r>
+        <w:rPr>
+          <w:rFonts w:ascii="Calibri" w:hAnsi="Calibri"/>
+          <w:color w:val="0F172A"/>
+          <w:sz w:val="19"/>
+        </w:rPr>
+        <w:t>• Conexión de la Service Account (maxibot-sa) a la Unidad Compartida de Google Workspace para respaldo automático.</w:t>
+      </w:r>
+    </w:p>
+    <w:p>
+      <w:pPr>
+        <w:spacing w:after="80" w:line="276" w:lineRule="auto"/>
+      </w:pPr>
+      <w:r>
+        <w:rPr>
+          <w:rFonts w:ascii="Calibri" w:hAnsi="Calibri"/>
+          <w:color w:val="0F172A"/>
+          <w:sz w:val="19"/>
+        </w:rPr>
+        <w:t>• Capacitación del 100% de los analistas de procesos en el uso del Pipeline de 3 Pasos (SIPOC ➔ Flujo ➔ Narrativa).</w:t>
       </w:r>
     </w:p>
     <w:sectPr>

</xml_diff>